<commit_message>
fix(ws1): align Slide 1 and Slide 15 internal slide-number cross-references to 15-slide layout
</commit_message>
<xml_diff>
--- a/docs/word/ws1-reference-architecture-taxonomy-and-5hop-baseline.docx
+++ b/docs/word/ws1-reference-architecture-taxonomy-and-5hop-baseline.docx
@@ -9,7 +9,7 @@
         <w:keepLines w:val="1"/>
         <w:rPr/>
       </w:pPr>
-      <w:bookmarkStart w:colFirst="0" w:colLast="0" w:name="_mldtfalove26" w:id="0"/>
+      <w:bookmarkStart w:colFirst="0" w:colLast="0" w:name="_v0rhck8b3ips" w:id="0"/>
       <w:bookmarkEnd w:id="0"/>
       <w:r>
         <w:rPr>
@@ -459,7 +459,7 @@
                   <w:u w:val="single"/>
                   <w:rtl w:val="0"/>
                 </w:rPr>
-                <w:t xml:space="preserve">Google Slides (11 Slides)</w:t>
+                <w:t xml:space="preserve">Google Slides (15 Slides)</w:t>
               </w:r>
             </w:hyperlink>
             <w:r>
@@ -529,7 +529,7 @@
         <w:shd w:fill="auto" w:val="clear"/>
         <w:rPr/>
       </w:pPr>
-      <w:bookmarkStart w:colFirst="0" w:colLast="0" w:name="_vp8ou6eexuco" w:id="1"/>
+      <w:bookmarkStart w:colFirst="0" w:colLast="0" w:name="_bk3nd21d61c4" w:id="1"/>
       <w:bookmarkEnd w:id="1"/>
       <w:r>
         <w:rPr>
@@ -736,7 +736,7 @@
         <w:keepLines w:val="1"/>
         <w:rPr/>
       </w:pPr>
-      <w:bookmarkStart w:colFirst="0" w:colLast="0" w:name="_n5zwvme7i7i9" w:id="2"/>
+      <w:bookmarkStart w:colFirst="0" w:colLast="0" w:name="_qoftvfmwou39" w:id="2"/>
       <w:bookmarkEnd w:id="2"/>
       <w:r>
         <w:rPr>
@@ -763,7 +763,7 @@
             <w:u w:val="single"/>
             <w:rtl w:val="0"/>
           </w:rPr>
-          <w:t xml:space="preserve">11-slide editable deck (</w:t>
+          <w:t xml:space="preserve">15-slide editable deck (</w:t>
         </w:r>
       </w:hyperlink>
       <w:hyperlink r:id="rId16">
@@ -798,7 +798,7 @@
       <w:pPr>
         <w:numPr>
           <w:ilvl w:val="0"/>
-          <w:numId w:val="15"/>
+          <w:numId w:val="8"/>
         </w:numPr>
         <w:spacing w:after="0" w:afterAutospacing="0" w:lineRule="auto"/>
         <w:ind w:left="720" w:hanging="360"/>
@@ -891,7 +891,7 @@
       <w:pPr>
         <w:numPr>
           <w:ilvl w:val="0"/>
-          <w:numId w:val="15"/>
+          <w:numId w:val="8"/>
         </w:numPr>
         <w:spacing w:after="0" w:afterAutospacing="0" w:lineRule="auto"/>
         <w:ind w:left="720" w:hanging="360"/>
@@ -970,7 +970,7 @@
       <w:pPr>
         <w:numPr>
           <w:ilvl w:val="0"/>
-          <w:numId w:val="15"/>
+          <w:numId w:val="8"/>
         </w:numPr>
         <w:spacing w:after="0" w:afterAutospacing="0" w:lineRule="auto"/>
         <w:ind w:left="720" w:hanging="360"/>
@@ -1035,7 +1035,7 @@
       <w:pPr>
         <w:numPr>
           <w:ilvl w:val="0"/>
-          <w:numId w:val="15"/>
+          <w:numId w:val="8"/>
         </w:numPr>
         <w:spacing w:after="200" w:lineRule="auto"/>
         <w:ind w:left="720" w:hanging="360"/>
@@ -1215,7 +1215,7 @@
         <w:keepLines w:val="1"/>
         <w:rPr/>
       </w:pPr>
-      <w:bookmarkStart w:colFirst="0" w:colLast="0" w:name="_5kp7odkx16c7" w:id="3"/>
+      <w:bookmarkStart w:colFirst="0" w:colLast="0" w:name="_b3y40xrofgbm" w:id="3"/>
       <w:bookmarkEnd w:id="3"/>
       <w:r>
         <w:rPr>
@@ -1270,7 +1270,7 @@
       <w:pPr>
         <w:numPr>
           <w:ilvl w:val="0"/>
-          <w:numId w:val="23"/>
+          <w:numId w:val="3"/>
         </w:numPr>
         <w:spacing w:after="0" w:afterAutospacing="0" w:lineRule="auto"/>
         <w:ind w:left="720" w:hanging="360"/>
@@ -1381,7 +1381,7 @@
       <w:pPr>
         <w:numPr>
           <w:ilvl w:val="0"/>
-          <w:numId w:val="23"/>
+          <w:numId w:val="3"/>
         </w:numPr>
         <w:spacing w:after="0" w:afterAutospacing="0" w:lineRule="auto"/>
         <w:ind w:left="720" w:hanging="360"/>
@@ -1430,134 +1430,6 @@
           <w:rtl w:val="0"/>
         </w:rPr>
         <w:t xml:space="preserve"> kill-switch. FinVault can choose between two sovereign inference models inside Pattern B:</w:t>
-      </w:r>
-    </w:p>
-    <w:p>
-      <w:pPr>
-        <w:numPr>
-          <w:ilvl w:val="0"/>
-          <w:numId w:val="6"/>
-        </w:numPr>
-        <w:spacing w:after="0" w:afterAutospacing="0" w:lineRule="auto"/>
-        <w:ind w:left="1440" w:hanging="360"/>
-        <w:rPr>
-          <w:u w:val="none"/>
-        </w:rPr>
-      </w:pPr>
-      <w:r>
-        <w:rPr>
-          <w:b w:val="1"/>
-          <w:bCs w:val="1"/>
-          <w:rtl w:val="0"/>
-        </w:rPr>
-        <w:t xml:space="preserve">Managed Vertex AI Dedicated Provisioned Throughput (</w:t>
-      </w:r>
-      <w:r>
-        <w:rPr>
-          <w:rFonts w:ascii="Roboto Mono" w:cs="Roboto Mono" w:eastAsia="Roboto Mono" w:hAnsi="Roboto Mono"/>
-          <w:b w:val="1"/>
-          <w:bCs w:val="1"/>
-          <w:color w:val="188038"/>
-          <w:rtl w:val="0"/>
-        </w:rPr>
-        <w:t xml:space="preserve">gemini-2.5-pro-dedicated</w:t>
-      </w:r>
-      <w:r>
-        <w:rPr>
-          <w:b w:val="1"/>
-          <w:bCs w:val="1"/>
-          <w:rtl w:val="0"/>
-        </w:rPr>
-        <w:t xml:space="preserve">):</w:t>
-      </w:r>
-      <w:r>
-        <w:rPr>
-          <w:rtl w:val="0"/>
-        </w:rPr>
-        <w:t xml:space="preserve"> A reserved-capacity SaaS Gemini 2.5 Pro endpoint inside the tenant's VPC Service Controls perimeter with </w:t>
-      </w:r>
-      <w:r>
-        <w:rPr>
-          <w:b w:val="1"/>
-          <w:bCs w:val="1"/>
-          <w:rtl w:val="0"/>
-        </w:rPr>
-        <w:t xml:space="preserve">zero Kubernetes or GPU operational overhead</w:t>
-      </w:r>
-      <w:r>
-        <w:rPr>
-          <w:rtl w:val="0"/>
-        </w:rPr>
-        <w:t xml:space="preserve">.</w:t>
-      </w:r>
-    </w:p>
-    <w:p>
-      <w:pPr>
-        <w:numPr>
-          <w:ilvl w:val="0"/>
-          <w:numId w:val="6"/>
-        </w:numPr>
-        <w:spacing w:after="0" w:afterAutospacing="0" w:lineRule="auto"/>
-        <w:ind w:left="1440" w:hanging="360"/>
-        <w:rPr>
-          <w:u w:val="none"/>
-        </w:rPr>
-      </w:pPr>
-      <w:r>
-        <w:rPr>
-          <w:b w:val="1"/>
-          <w:bCs w:val="1"/>
-          <w:rtl w:val="0"/>
-        </w:rPr>
-        <w:t xml:space="preserve">Self-Managed Air-Gapped Gemma 3 (27B) on Private GKE:</w:t>
-      </w:r>
-      <w:r>
-        <w:rPr>
-          <w:rtl w:val="0"/>
-        </w:rPr>
-        <w:t xml:space="preserve"> Customer-managed GPU node pools (</w:t>
-      </w:r>
-      <w:r>
-        <w:rPr>
-          <w:rFonts w:ascii="Roboto Mono" w:cs="Roboto Mono" w:eastAsia="Roboto Mono" w:hAnsi="Roboto Mono"/>
-          <w:color w:val="188038"/>
-          <w:rtl w:val="0"/>
-        </w:rPr>
-        <w:t xml:space="preserve">g2-standard-48</w:t>
-      </w:r>
-      <w:r>
-        <w:rPr>
-          <w:rtl w:val="0"/>
-        </w:rPr>
-        <w:t xml:space="preserve"> L4 GPUs) running open-weight Gemma 3 (27B IT) inside a private GKE cluster with </w:t>
-      </w:r>
-      <w:r>
-        <w:rPr>
-          <w:rFonts w:ascii="Roboto Mono" w:cs="Roboto Mono" w:eastAsia="Roboto Mono" w:hAnsi="Roboto Mono"/>
-          <w:color w:val="188038"/>
-          <w:rtl w:val="0"/>
-        </w:rPr>
-        <w:t xml:space="preserve">0.0.0.0/0</w:t>
-      </w:r>
-      <w:r>
-        <w:rPr>
-          <w:rtl w:val="0"/>
-        </w:rPr>
-        <w:t xml:space="preserve"> public internet egress completely blocked and weights pulled exclusively via Restricted VIP (</w:t>
-      </w:r>
-      <w:r>
-        <w:rPr>
-          <w:rFonts w:ascii="Roboto Mono" w:cs="Roboto Mono" w:eastAsia="Roboto Mono" w:hAnsi="Roboto Mono"/>
-          <w:color w:val="188038"/>
-          <w:rtl w:val="0"/>
-        </w:rPr>
-        <w:t xml:space="preserve">199.36.153.4/30</w:t>
-      </w:r>
-      <w:r>
-        <w:rPr>
-          <w:rtl w:val="0"/>
-        </w:rPr>
-        <w:t xml:space="preserve">).</w:t>
       </w:r>
     </w:p>
     <w:p>
@@ -1566,6 +1438,134 @@
           <w:ilvl w:val="0"/>
           <w:numId w:val="7"/>
         </w:numPr>
+        <w:spacing w:after="0" w:afterAutospacing="0" w:lineRule="auto"/>
+        <w:ind w:left="1440" w:hanging="360"/>
+        <w:rPr>
+          <w:u w:val="none"/>
+        </w:rPr>
+      </w:pPr>
+      <w:r>
+        <w:rPr>
+          <w:b w:val="1"/>
+          <w:bCs w:val="1"/>
+          <w:rtl w:val="0"/>
+        </w:rPr>
+        <w:t xml:space="preserve">Managed Vertex AI Dedicated Provisioned Throughput (</w:t>
+      </w:r>
+      <w:r>
+        <w:rPr>
+          <w:rFonts w:ascii="Roboto Mono" w:cs="Roboto Mono" w:eastAsia="Roboto Mono" w:hAnsi="Roboto Mono"/>
+          <w:b w:val="1"/>
+          <w:bCs w:val="1"/>
+          <w:color w:val="188038"/>
+          <w:rtl w:val="0"/>
+        </w:rPr>
+        <w:t xml:space="preserve">gemini-2.5-pro-dedicated</w:t>
+      </w:r>
+      <w:r>
+        <w:rPr>
+          <w:b w:val="1"/>
+          <w:bCs w:val="1"/>
+          <w:rtl w:val="0"/>
+        </w:rPr>
+        <w:t xml:space="preserve">):</w:t>
+      </w:r>
+      <w:r>
+        <w:rPr>
+          <w:rtl w:val="0"/>
+        </w:rPr>
+        <w:t xml:space="preserve"> A reserved-capacity SaaS Gemini 2.5 Pro endpoint inside the tenant's VPC Service Controls perimeter with </w:t>
+      </w:r>
+      <w:r>
+        <w:rPr>
+          <w:b w:val="1"/>
+          <w:bCs w:val="1"/>
+          <w:rtl w:val="0"/>
+        </w:rPr>
+        <w:t xml:space="preserve">zero Kubernetes or GPU operational overhead</w:t>
+      </w:r>
+      <w:r>
+        <w:rPr>
+          <w:rtl w:val="0"/>
+        </w:rPr>
+        <w:t xml:space="preserve">.</w:t>
+      </w:r>
+    </w:p>
+    <w:p>
+      <w:pPr>
+        <w:numPr>
+          <w:ilvl w:val="0"/>
+          <w:numId w:val="7"/>
+        </w:numPr>
+        <w:spacing w:after="0" w:afterAutospacing="0" w:lineRule="auto"/>
+        <w:ind w:left="1440" w:hanging="360"/>
+        <w:rPr>
+          <w:u w:val="none"/>
+        </w:rPr>
+      </w:pPr>
+      <w:r>
+        <w:rPr>
+          <w:b w:val="1"/>
+          <w:bCs w:val="1"/>
+          <w:rtl w:val="0"/>
+        </w:rPr>
+        <w:t xml:space="preserve">Self-Managed Air-Gapped Gemma 3 (27B) on Private GKE:</w:t>
+      </w:r>
+      <w:r>
+        <w:rPr>
+          <w:rtl w:val="0"/>
+        </w:rPr>
+        <w:t xml:space="preserve"> Customer-managed GPU node pools (</w:t>
+      </w:r>
+      <w:r>
+        <w:rPr>
+          <w:rFonts w:ascii="Roboto Mono" w:cs="Roboto Mono" w:eastAsia="Roboto Mono" w:hAnsi="Roboto Mono"/>
+          <w:color w:val="188038"/>
+          <w:rtl w:val="0"/>
+        </w:rPr>
+        <w:t xml:space="preserve">g2-standard-48</w:t>
+      </w:r>
+      <w:r>
+        <w:rPr>
+          <w:rtl w:val="0"/>
+        </w:rPr>
+        <w:t xml:space="preserve"> L4 GPUs) running open-weight Gemma 3 (27B IT) inside a private GKE cluster with </w:t>
+      </w:r>
+      <w:r>
+        <w:rPr>
+          <w:rFonts w:ascii="Roboto Mono" w:cs="Roboto Mono" w:eastAsia="Roboto Mono" w:hAnsi="Roboto Mono"/>
+          <w:color w:val="188038"/>
+          <w:rtl w:val="0"/>
+        </w:rPr>
+        <w:t xml:space="preserve">0.0.0.0/0</w:t>
+      </w:r>
+      <w:r>
+        <w:rPr>
+          <w:rtl w:val="0"/>
+        </w:rPr>
+        <w:t xml:space="preserve"> public internet egress completely blocked and weights pulled exclusively via Restricted VIP (</w:t>
+      </w:r>
+      <w:r>
+        <w:rPr>
+          <w:rFonts w:ascii="Roboto Mono" w:cs="Roboto Mono" w:eastAsia="Roboto Mono" w:hAnsi="Roboto Mono"/>
+          <w:color w:val="188038"/>
+          <w:rtl w:val="0"/>
+        </w:rPr>
+        <w:t xml:space="preserve">199.36.153.4/30</w:t>
+      </w:r>
+      <w:r>
+        <w:rPr>
+          <w:rtl w:val="0"/>
+        </w:rPr>
+        <w:t xml:space="preserve">).</w:t>
+      </w:r>
+    </w:p>
+    <w:p>
+      <w:pPr>
+        <w:numPr>
+          <w:ilvl w:val="0"/>
+          <w:numId w:val="5"/>
+        </w:numPr>
         <w:spacing w:after="200" w:lineRule="auto"/>
         <w:ind w:left="720" w:hanging="360"/>
         <w:rPr>
@@ -1636,7 +1636,7 @@
         <w:keepLines w:val="1"/>
         <w:rPr/>
       </w:pPr>
-      <w:bookmarkStart w:colFirst="0" w:colLast="0" w:name="_ukysvk8rjz" w:id="4"/>
+      <w:bookmarkStart w:colFirst="0" w:colLast="0" w:name="_j80quqwf6d3g" w:id="4"/>
       <w:bookmarkEnd w:id="4"/>
       <w:r>
         <w:rPr>
@@ -1717,7 +1717,7 @@
       <w:pPr>
         <w:numPr>
           <w:ilvl w:val="0"/>
-          <w:numId w:val="13"/>
+          <w:numId w:val="2"/>
         </w:numPr>
         <w:spacing w:after="0" w:afterAutospacing="0" w:lineRule="auto"/>
         <w:ind w:left="720" w:hanging="360"/>
@@ -1804,7 +1804,7 @@
       <w:pPr>
         <w:numPr>
           <w:ilvl w:val="0"/>
-          <w:numId w:val="13"/>
+          <w:numId w:val="2"/>
         </w:numPr>
         <w:spacing w:after="0" w:afterAutospacing="0" w:lineRule="auto"/>
         <w:ind w:left="720" w:hanging="360"/>
@@ -1891,7 +1891,7 @@
       <w:pPr>
         <w:numPr>
           <w:ilvl w:val="0"/>
-          <w:numId w:val="13"/>
+          <w:numId w:val="2"/>
         </w:numPr>
         <w:spacing w:after="0" w:afterAutospacing="0" w:lineRule="auto"/>
         <w:ind w:left="720" w:hanging="360"/>
@@ -2006,7 +2006,7 @@
       <w:pPr>
         <w:numPr>
           <w:ilvl w:val="0"/>
-          <w:numId w:val="13"/>
+          <w:numId w:val="2"/>
         </w:numPr>
         <w:spacing w:after="0" w:afterAutospacing="0" w:lineRule="auto"/>
         <w:ind w:left="720" w:hanging="360"/>
@@ -2121,7 +2121,7 @@
       <w:pPr>
         <w:numPr>
           <w:ilvl w:val="0"/>
-          <w:numId w:val="13"/>
+          <w:numId w:val="2"/>
         </w:numPr>
         <w:spacing w:after="200" w:lineRule="auto"/>
         <w:ind w:left="720" w:hanging="360"/>
@@ -2239,7 +2239,7 @@
         <w:keepLines w:val="1"/>
         <w:rPr/>
       </w:pPr>
-      <w:bookmarkStart w:colFirst="0" w:colLast="0" w:name="_uxgwi9vmipz6" w:id="5"/>
+      <w:bookmarkStart w:colFirst="0" w:colLast="0" w:name="_jnahbswzus3w" w:id="5"/>
       <w:bookmarkEnd w:id="5"/>
       <w:r>
         <w:rPr>
@@ -5064,7 +5064,7 @@
         <w:spacing w:before="360" w:lineRule="auto"/>
         <w:rPr/>
       </w:pPr>
-      <w:bookmarkStart w:colFirst="0" w:colLast="0" w:name="_ch5t6ztu1p0c" w:id="6"/>
+      <w:bookmarkStart w:colFirst="0" w:colLast="0" w:name="_rg6qmnipyuj0" w:id="6"/>
       <w:bookmarkEnd w:id="6"/>
       <w:r>
         <w:rPr>
@@ -7065,7 +7065,7 @@
         <w:spacing w:before="360" w:lineRule="auto"/>
         <w:rPr/>
       </w:pPr>
-      <w:bookmarkStart w:colFirst="0" w:colLast="0" w:name="_4j7nzms3hypc" w:id="7"/>
+      <w:bookmarkStart w:colFirst="0" w:colLast="0" w:name="_wuxdc4h1cn3q" w:id="7"/>
       <w:bookmarkEnd w:id="7"/>
       <w:r>
         <w:rPr>
@@ -8343,7 +8343,7 @@
         <w:keepLines w:val="1"/>
         <w:rPr/>
       </w:pPr>
-      <w:bookmarkStart w:colFirst="0" w:colLast="0" w:name="_lg72v6wvy03e" w:id="8"/>
+      <w:bookmarkStart w:colFirst="0" w:colLast="0" w:name="_z9chkr67mkg9" w:id="8"/>
       <w:bookmarkEnd w:id="8"/>
       <w:r>
         <w:rPr>
@@ -8393,14 +8393,14 @@
         <w:rPr>
           <w:rtl w:val="0"/>
         </w:rPr>
-        <w:t xml:space="preserve"> across the companion 11-slide deck:</w:t>
+        <w:t xml:space="preserve"> across the companion 15-slide deck:</w:t>
       </w:r>
     </w:p>
     <w:p>
       <w:pPr>
         <w:numPr>
           <w:ilvl w:val="0"/>
-          <w:numId w:val="16"/>
+          <w:numId w:val="15"/>
         </w:numPr>
         <w:spacing w:after="0" w:afterAutospacing="0" w:lineRule="auto"/>
         <w:ind w:left="720" w:hanging="360"/>
@@ -8479,7 +8479,7 @@
       <w:pPr>
         <w:numPr>
           <w:ilvl w:val="0"/>
-          <w:numId w:val="16"/>
+          <w:numId w:val="15"/>
         </w:numPr>
         <w:spacing w:after="0" w:afterAutospacing="0" w:lineRule="auto"/>
         <w:ind w:left="720" w:hanging="360"/>
@@ -8586,7 +8586,7 @@
       <w:pPr>
         <w:numPr>
           <w:ilvl w:val="0"/>
-          <w:numId w:val="16"/>
+          <w:numId w:val="15"/>
         </w:numPr>
         <w:spacing w:after="0" w:afterAutospacing="0" w:lineRule="auto"/>
         <w:ind w:left="720" w:hanging="360"/>
@@ -8651,7 +8651,7 @@
       <w:pPr>
         <w:numPr>
           <w:ilvl w:val="0"/>
-          <w:numId w:val="16"/>
+          <w:numId w:val="15"/>
         </w:numPr>
         <w:spacing w:after="200" w:lineRule="auto"/>
         <w:ind w:left="720" w:hanging="360"/>
@@ -8724,12 +8724,12 @@
           <wp:inline distB="114300" distT="114300" distL="114300" distR="114300">
             <wp:extent cx="6731000" cy="7905563"/>
             <wp:effectExtent b="0" l="0" r="0" t="0"/>
-            <wp:docPr id="1" name="image5.png"/>
+            <wp:docPr id="2" name="image8.png"/>
             <a:graphic>
               <a:graphicData uri="http://schemas.openxmlformats.org/drawingml/2006/picture">
                 <pic:pic>
                   <pic:nvPicPr>
-                    <pic:cNvPr id="0" name="image5.png"/>
+                    <pic:cNvPr id="0" name="image8.png"/>
                     <pic:cNvPicPr preferRelativeResize="0"/>
                   </pic:nvPicPr>
                   <pic:blipFill>
@@ -8900,7 +8900,7 @@
       <w:pPr>
         <w:numPr>
           <w:ilvl w:val="0"/>
-          <w:numId w:val="17"/>
+          <w:numId w:val="1"/>
         </w:numPr>
         <w:spacing w:after="0" w:afterAutospacing="0" w:lineRule="auto"/>
         <w:ind w:left="720" w:hanging="360"/>
@@ -8990,7 +8990,7 @@
       <w:pPr>
         <w:numPr>
           <w:ilvl w:val="0"/>
-          <w:numId w:val="17"/>
+          <w:numId w:val="1"/>
         </w:numPr>
         <w:spacing w:after="0" w:afterAutospacing="0" w:lineRule="auto"/>
         <w:ind w:left="720" w:hanging="360"/>
@@ -9097,7 +9097,7 @@
       <w:pPr>
         <w:numPr>
           <w:ilvl w:val="0"/>
-          <w:numId w:val="17"/>
+          <w:numId w:val="1"/>
         </w:numPr>
         <w:spacing w:after="0" w:afterAutospacing="0" w:lineRule="auto"/>
         <w:ind w:left="720" w:hanging="360"/>
@@ -9264,7 +9264,7 @@
       <w:pPr>
         <w:numPr>
           <w:ilvl w:val="0"/>
-          <w:numId w:val="17"/>
+          <w:numId w:val="1"/>
         </w:numPr>
         <w:spacing w:after="200" w:lineRule="auto"/>
         <w:ind w:left="720" w:hanging="360"/>
@@ -9436,7 +9436,7 @@
       <w:pPr>
         <w:numPr>
           <w:ilvl w:val="0"/>
-          <w:numId w:val="18"/>
+          <w:numId w:val="12"/>
         </w:numPr>
         <w:spacing w:after="0" w:afterAutospacing="0" w:lineRule="auto"/>
         <w:ind w:left="720" w:hanging="360"/>
@@ -9509,7 +9509,7 @@
       <w:pPr>
         <w:numPr>
           <w:ilvl w:val="0"/>
-          <w:numId w:val="18"/>
+          <w:numId w:val="12"/>
         </w:numPr>
         <w:spacing w:after="0" w:afterAutospacing="0" w:lineRule="auto"/>
         <w:ind w:left="720" w:hanging="360"/>
@@ -9708,7 +9708,7 @@
       <w:pPr>
         <w:numPr>
           <w:ilvl w:val="0"/>
-          <w:numId w:val="18"/>
+          <w:numId w:val="12"/>
         </w:numPr>
         <w:spacing w:after="0" w:afterAutospacing="0" w:lineRule="auto"/>
         <w:ind w:left="720" w:hanging="360"/>
@@ -9967,7 +9967,7 @@
       <w:pPr>
         <w:numPr>
           <w:ilvl w:val="0"/>
-          <w:numId w:val="18"/>
+          <w:numId w:val="12"/>
         </w:numPr>
         <w:spacing w:after="0" w:afterAutospacing="0" w:lineRule="auto"/>
         <w:ind w:left="720" w:hanging="360"/>
@@ -10096,7 +10096,7 @@
       <w:pPr>
         <w:numPr>
           <w:ilvl w:val="0"/>
-          <w:numId w:val="18"/>
+          <w:numId w:val="12"/>
         </w:numPr>
         <w:spacing w:after="0" w:afterAutospacing="0" w:lineRule="auto"/>
         <w:ind w:left="720" w:hanging="360"/>
@@ -10323,7 +10323,7 @@
       <w:pPr>
         <w:numPr>
           <w:ilvl w:val="0"/>
-          <w:numId w:val="18"/>
+          <w:numId w:val="12"/>
         </w:numPr>
         <w:spacing w:after="0" w:afterAutospacing="0" w:lineRule="auto"/>
         <w:ind w:left="720" w:hanging="360"/>
@@ -10424,7 +10424,7 @@
       <w:pPr>
         <w:numPr>
           <w:ilvl w:val="0"/>
-          <w:numId w:val="18"/>
+          <w:numId w:val="12"/>
         </w:numPr>
         <w:spacing w:after="200" w:lineRule="auto"/>
         <w:ind w:left="720" w:hanging="360"/>
@@ -10556,7 +10556,7 @@
         <w:keepLines w:val="1"/>
         <w:rPr/>
       </w:pPr>
-      <w:bookmarkStart w:colFirst="0" w:colLast="0" w:name="_42wb0eanrqpe" w:id="9"/>
+      <w:bookmarkStart w:colFirst="0" w:colLast="0" w:name="_rj6ltaz4eake" w:id="9"/>
       <w:bookmarkEnd w:id="9"/>
       <w:r>
         <w:rPr>
@@ -10579,12 +10579,12 @@
           <wp:inline distB="114300" distT="114300" distL="114300" distR="114300">
             <wp:extent cx="6731000" cy="7905563"/>
             <wp:effectExtent b="0" l="0" r="0" t="0"/>
-            <wp:docPr id="4" name="image6.png"/>
+            <wp:docPr id="5" name="image4.png"/>
             <a:graphic>
               <a:graphicData uri="http://schemas.openxmlformats.org/drawingml/2006/picture">
                 <pic:pic>
                   <pic:nvPicPr>
-                    <pic:cNvPr id="0" name="image6.png"/>
+                    <pic:cNvPr id="0" name="image4.png"/>
                     <pic:cNvPicPr preferRelativeResize="0"/>
                   </pic:nvPicPr>
                   <pic:blipFill>
@@ -10757,7 +10757,7 @@
       <w:pPr>
         <w:numPr>
           <w:ilvl w:val="0"/>
-          <w:numId w:val="4"/>
+          <w:numId w:val="13"/>
         </w:numPr>
         <w:spacing w:after="0" w:afterAutospacing="0" w:lineRule="auto"/>
         <w:ind w:left="720" w:hanging="360"/>
@@ -10844,7 +10844,7 @@
       <w:pPr>
         <w:numPr>
           <w:ilvl w:val="0"/>
-          <w:numId w:val="4"/>
+          <w:numId w:val="13"/>
         </w:numPr>
         <w:spacing w:after="0" w:afterAutospacing="0" w:lineRule="auto"/>
         <w:ind w:left="720" w:hanging="360"/>
@@ -10903,7 +10903,7 @@
       <w:pPr>
         <w:numPr>
           <w:ilvl w:val="0"/>
-          <w:numId w:val="4"/>
+          <w:numId w:val="13"/>
         </w:numPr>
         <w:spacing w:after="0" w:afterAutospacing="0" w:lineRule="auto"/>
         <w:ind w:left="720" w:hanging="360"/>
@@ -10990,7 +10990,7 @@
       <w:pPr>
         <w:numPr>
           <w:ilvl w:val="0"/>
-          <w:numId w:val="4"/>
+          <w:numId w:val="13"/>
         </w:numPr>
         <w:spacing w:after="200" w:lineRule="auto"/>
         <w:ind w:left="720" w:hanging="360"/>
@@ -11120,7 +11120,7 @@
       <w:pPr>
         <w:numPr>
           <w:ilvl w:val="0"/>
-          <w:numId w:val="14"/>
+          <w:numId w:val="6"/>
         </w:numPr>
         <w:spacing w:after="0" w:afterAutospacing="0" w:lineRule="auto"/>
         <w:ind w:left="720" w:hanging="360"/>
@@ -11221,7 +11221,7 @@
       <w:pPr>
         <w:numPr>
           <w:ilvl w:val="0"/>
-          <w:numId w:val="14"/>
+          <w:numId w:val="6"/>
         </w:numPr>
         <w:spacing w:after="0" w:afterAutospacing="0" w:lineRule="auto"/>
         <w:ind w:left="720" w:hanging="360"/>
@@ -11406,7 +11406,7 @@
       <w:pPr>
         <w:numPr>
           <w:ilvl w:val="0"/>
-          <w:numId w:val="14"/>
+          <w:numId w:val="6"/>
         </w:numPr>
         <w:spacing w:after="0" w:afterAutospacing="0" w:lineRule="auto"/>
         <w:ind w:left="720" w:hanging="360"/>
@@ -11637,7 +11637,7 @@
       <w:pPr>
         <w:numPr>
           <w:ilvl w:val="0"/>
-          <w:numId w:val="14"/>
+          <w:numId w:val="6"/>
         </w:numPr>
         <w:spacing w:after="0" w:afterAutospacing="0" w:lineRule="auto"/>
         <w:ind w:left="720" w:hanging="360"/>
@@ -11766,7 +11766,7 @@
       <w:pPr>
         <w:numPr>
           <w:ilvl w:val="0"/>
-          <w:numId w:val="14"/>
+          <w:numId w:val="6"/>
         </w:numPr>
         <w:spacing w:after="0" w:afterAutospacing="0" w:lineRule="auto"/>
         <w:ind w:left="720" w:hanging="360"/>
@@ -11965,7 +11965,7 @@
       <w:pPr>
         <w:numPr>
           <w:ilvl w:val="0"/>
-          <w:numId w:val="14"/>
+          <w:numId w:val="6"/>
         </w:numPr>
         <w:spacing w:after="0" w:afterAutospacing="0" w:lineRule="auto"/>
         <w:ind w:left="720" w:hanging="360"/>
@@ -12038,7 +12038,7 @@
       <w:pPr>
         <w:numPr>
           <w:ilvl w:val="0"/>
-          <w:numId w:val="14"/>
+          <w:numId w:val="6"/>
         </w:numPr>
         <w:spacing w:after="200" w:lineRule="auto"/>
         <w:ind w:left="720" w:hanging="360"/>
@@ -12142,7 +12142,7 @@
         <w:keepLines w:val="1"/>
         <w:rPr/>
       </w:pPr>
-      <w:bookmarkStart w:colFirst="0" w:colLast="0" w:name="_oa65rvze3wlc" w:id="10"/>
+      <w:bookmarkStart w:colFirst="0" w:colLast="0" w:name="_55tkoqoj5gcl" w:id="10"/>
       <w:bookmarkEnd w:id="10"/>
       <w:r>
         <w:rPr>
@@ -12172,7 +12172,7 @@
           <w:vertAlign w:val="baseline"/>
         </w:rPr>
       </w:pPr>
-      <w:bookmarkStart w:colFirst="0" w:colLast="0" w:name="_edpkdrmnokwx" w:id="11"/>
+      <w:bookmarkStart w:colFirst="0" w:colLast="0" w:name="_c04yj5b1egue" w:id="11"/>
       <w:bookmarkEnd w:id="11"/>
       <w:r>
         <w:rPr>
@@ -12186,7 +12186,7 @@
       <w:pPr>
         <w:numPr>
           <w:ilvl w:val="0"/>
-          <w:numId w:val="1"/>
+          <w:numId w:val="21"/>
         </w:numPr>
         <w:spacing w:after="0" w:afterAutospacing="0" w:lineRule="auto"/>
         <w:ind w:left="720" w:hanging="360"/>
@@ -12234,7 +12234,7 @@
       <w:pPr>
         <w:numPr>
           <w:ilvl w:val="0"/>
-          <w:numId w:val="1"/>
+          <w:numId w:val="21"/>
         </w:numPr>
         <w:spacing w:after="0" w:afterAutospacing="0" w:lineRule="auto"/>
         <w:ind w:left="720" w:hanging="360"/>
@@ -12314,7 +12314,7 @@
       <w:pPr>
         <w:numPr>
           <w:ilvl w:val="0"/>
-          <w:numId w:val="1"/>
+          <w:numId w:val="21"/>
         </w:numPr>
         <w:spacing w:after="0" w:afterAutospacing="0" w:lineRule="auto"/>
         <w:ind w:left="720" w:hanging="360"/>
@@ -12378,7 +12378,7 @@
       <w:pPr>
         <w:numPr>
           <w:ilvl w:val="0"/>
-          <w:numId w:val="1"/>
+          <w:numId w:val="21"/>
         </w:numPr>
         <w:spacing w:after="0" w:afterAutospacing="0" w:lineRule="auto"/>
         <w:ind w:left="720" w:hanging="360"/>
@@ -12426,7 +12426,7 @@
       <w:pPr>
         <w:numPr>
           <w:ilvl w:val="0"/>
-          <w:numId w:val="1"/>
+          <w:numId w:val="21"/>
         </w:numPr>
         <w:spacing w:after="200" w:lineRule="auto"/>
         <w:ind w:left="720" w:hanging="360"/>
@@ -12460,7 +12460,7 @@
           <w:vertAlign w:val="baseline"/>
         </w:rPr>
       </w:pPr>
-      <w:bookmarkStart w:colFirst="0" w:colLast="0" w:name="_mka89qcda2nb" w:id="12"/>
+      <w:bookmarkStart w:colFirst="0" w:colLast="0" w:name="_a83ucgqa5qww" w:id="12"/>
       <w:bookmarkEnd w:id="12"/>
       <w:r>
         <w:rPr>
@@ -12474,7 +12474,7 @@
       <w:pPr>
         <w:numPr>
           <w:ilvl w:val="0"/>
-          <w:numId w:val="9"/>
+          <w:numId w:val="17"/>
         </w:numPr>
         <w:spacing w:after="0" w:afterAutospacing="0" w:lineRule="auto"/>
         <w:ind w:left="720" w:hanging="360"/>
@@ -12506,7 +12506,7 @@
       <w:pPr>
         <w:numPr>
           <w:ilvl w:val="0"/>
-          <w:numId w:val="9"/>
+          <w:numId w:val="17"/>
         </w:numPr>
         <w:spacing w:after="0" w:afterAutospacing="0" w:lineRule="auto"/>
         <w:ind w:left="720" w:hanging="360"/>
@@ -12554,7 +12554,7 @@
       <w:pPr>
         <w:numPr>
           <w:ilvl w:val="0"/>
-          <w:numId w:val="9"/>
+          <w:numId w:val="17"/>
         </w:numPr>
         <w:spacing w:after="0" w:afterAutospacing="0" w:lineRule="auto"/>
         <w:ind w:left="720" w:hanging="360"/>
@@ -12604,7 +12604,7 @@
       <w:pPr>
         <w:numPr>
           <w:ilvl w:val="0"/>
-          <w:numId w:val="9"/>
+          <w:numId w:val="17"/>
         </w:numPr>
         <w:spacing w:after="0" w:afterAutospacing="0" w:lineRule="auto"/>
         <w:ind w:left="720" w:hanging="360"/>
@@ -12652,7 +12652,7 @@
       <w:pPr>
         <w:numPr>
           <w:ilvl w:val="0"/>
-          <w:numId w:val="9"/>
+          <w:numId w:val="17"/>
         </w:numPr>
         <w:spacing w:after="200" w:lineRule="auto"/>
         <w:ind w:left="720" w:hanging="360"/>
@@ -12686,7 +12686,7 @@
           <w:vertAlign w:val="baseline"/>
         </w:rPr>
       </w:pPr>
-      <w:bookmarkStart w:colFirst="0" w:colLast="0" w:name="_ob44yboa1qj0" w:id="13"/>
+      <w:bookmarkStart w:colFirst="0" w:colLast="0" w:name="_5182p8zfahr0" w:id="13"/>
       <w:bookmarkEnd w:id="13"/>
       <w:r>
         <w:rPr>
@@ -12700,7 +12700,7 @@
       <w:pPr>
         <w:numPr>
           <w:ilvl w:val="0"/>
-          <w:numId w:val="5"/>
+          <w:numId w:val="11"/>
         </w:numPr>
         <w:spacing w:after="0" w:afterAutospacing="0" w:lineRule="auto"/>
         <w:ind w:left="720" w:hanging="360"/>
@@ -12764,7 +12764,7 @@
       <w:pPr>
         <w:numPr>
           <w:ilvl w:val="0"/>
-          <w:numId w:val="5"/>
+          <w:numId w:val="11"/>
         </w:numPr>
         <w:spacing w:after="0" w:afterAutospacing="0" w:lineRule="auto"/>
         <w:ind w:left="720" w:hanging="360"/>
@@ -12814,7 +12814,7 @@
       <w:pPr>
         <w:numPr>
           <w:ilvl w:val="0"/>
-          <w:numId w:val="5"/>
+          <w:numId w:val="11"/>
         </w:numPr>
         <w:spacing w:after="0" w:afterAutospacing="0" w:lineRule="auto"/>
         <w:ind w:left="720" w:hanging="360"/>
@@ -12864,7 +12864,7 @@
       <w:pPr>
         <w:numPr>
           <w:ilvl w:val="0"/>
-          <w:numId w:val="5"/>
+          <w:numId w:val="11"/>
         </w:numPr>
         <w:spacing w:after="0" w:afterAutospacing="0" w:lineRule="auto"/>
         <w:ind w:left="720" w:hanging="360"/>
@@ -12912,7 +12912,7 @@
       <w:pPr>
         <w:numPr>
           <w:ilvl w:val="0"/>
-          <w:numId w:val="5"/>
+          <w:numId w:val="11"/>
         </w:numPr>
         <w:spacing w:after="200" w:lineRule="auto"/>
         <w:ind w:left="720" w:hanging="360"/>
@@ -12990,7 +12990,7 @@
         <w:keepLines w:val="1"/>
         <w:rPr/>
       </w:pPr>
-      <w:bookmarkStart w:colFirst="0" w:colLast="0" w:name="_4ewg77lqts0d" w:id="14"/>
+      <w:bookmarkStart w:colFirst="0" w:colLast="0" w:name="_xfg87benbund" w:id="14"/>
       <w:bookmarkEnd w:id="14"/>
       <w:r>
         <w:rPr>
@@ -13034,7 +13034,7 @@
         <w:keepLines w:val="1"/>
         <w:rPr/>
       </w:pPr>
-      <w:bookmarkStart w:colFirst="0" w:colLast="0" w:name="_mzdxgbq31meu" w:id="15"/>
+      <w:bookmarkStart w:colFirst="0" w:colLast="0" w:name="_h65ryz6af0lv" w:id="15"/>
       <w:bookmarkEnd w:id="15"/>
       <w:r>
         <w:rPr>
@@ -13047,7 +13047,7 @@
       <w:pPr>
         <w:numPr>
           <w:ilvl w:val="0"/>
-          <w:numId w:val="2"/>
+          <w:numId w:val="4"/>
         </w:numPr>
         <w:spacing w:after="0" w:afterAutospacing="0" w:lineRule="auto"/>
         <w:ind w:left="720" w:hanging="360"/>
@@ -13116,7 +13116,7 @@
       <w:pPr>
         <w:numPr>
           <w:ilvl w:val="0"/>
-          <w:numId w:val="2"/>
+          <w:numId w:val="4"/>
         </w:numPr>
         <w:spacing w:after="0" w:afterAutospacing="0" w:lineRule="auto"/>
         <w:ind w:left="720" w:hanging="360"/>
@@ -13245,7 +13245,7 @@
       <w:pPr>
         <w:numPr>
           <w:ilvl w:val="0"/>
-          <w:numId w:val="2"/>
+          <w:numId w:val="4"/>
         </w:numPr>
         <w:spacing w:after="0" w:afterAutospacing="0" w:lineRule="auto"/>
         <w:ind w:left="720" w:hanging="360"/>
@@ -13350,7 +13350,7 @@
       <w:pPr>
         <w:numPr>
           <w:ilvl w:val="0"/>
-          <w:numId w:val="2"/>
+          <w:numId w:val="4"/>
         </w:numPr>
         <w:spacing w:after="200" w:lineRule="auto"/>
         <w:ind w:left="720" w:hanging="360"/>
@@ -13450,7 +13450,7 @@
         <w:keepLines w:val="1"/>
         <w:rPr/>
       </w:pPr>
-      <w:bookmarkStart w:colFirst="0" w:colLast="0" w:name="_nn2h1o7pcbuc" w:id="16"/>
+      <w:bookmarkStart w:colFirst="0" w:colLast="0" w:name="_q7w5s82l1q5r" w:id="16"/>
       <w:bookmarkEnd w:id="16"/>
       <w:r>
         <w:rPr>
@@ -13463,7 +13463,7 @@
       <w:pPr>
         <w:numPr>
           <w:ilvl w:val="0"/>
-          <w:numId w:val="12"/>
+          <w:numId w:val="9"/>
         </w:numPr>
         <w:spacing w:after="0" w:afterAutospacing="0" w:lineRule="auto"/>
         <w:ind w:left="720" w:hanging="360"/>
@@ -13592,7 +13592,7 @@
       <w:pPr>
         <w:numPr>
           <w:ilvl w:val="0"/>
-          <w:numId w:val="12"/>
+          <w:numId w:val="9"/>
         </w:numPr>
         <w:spacing w:after="0" w:afterAutospacing="0" w:lineRule="auto"/>
         <w:ind w:left="720" w:hanging="360"/>
@@ -13683,7 +13683,7 @@
       <w:pPr>
         <w:numPr>
           <w:ilvl w:val="0"/>
-          <w:numId w:val="12"/>
+          <w:numId w:val="9"/>
         </w:numPr>
         <w:spacing w:after="200" w:lineRule="auto"/>
         <w:ind w:left="720" w:hanging="360"/>
@@ -13773,7 +13773,7 @@
         <w:keepLines w:val="1"/>
         <w:rPr/>
       </w:pPr>
-      <w:bookmarkStart w:colFirst="0" w:colLast="0" w:name="_tzsl1i57piz4" w:id="17"/>
+      <w:bookmarkStart w:colFirst="0" w:colLast="0" w:name="_wuyixushhqk7" w:id="17"/>
       <w:bookmarkEnd w:id="17"/>
       <w:r>
         <w:rPr>
@@ -13786,7 +13786,7 @@
       <w:pPr>
         <w:numPr>
           <w:ilvl w:val="0"/>
-          <w:numId w:val="8"/>
+          <w:numId w:val="20"/>
         </w:numPr>
         <w:spacing w:after="0" w:afterAutospacing="0" w:lineRule="auto"/>
         <w:ind w:left="720" w:hanging="360"/>
@@ -13873,7 +13873,7 @@
       <w:pPr>
         <w:numPr>
           <w:ilvl w:val="0"/>
-          <w:numId w:val="8"/>
+          <w:numId w:val="20"/>
         </w:numPr>
         <w:spacing w:after="200" w:lineRule="auto"/>
         <w:ind w:left="720" w:hanging="360"/>
@@ -13927,12 +13927,12 @@
           <wp:inline distB="114300" distT="114300" distL="114300" distR="114300">
             <wp:extent cx="5674680" cy="602869"/>
             <wp:effectExtent b="0" l="0" r="0" t="0"/>
-            <wp:docPr id="8" name="image2.png"/>
+            <wp:docPr id="1" name="image1.png"/>
             <a:graphic>
               <a:graphicData uri="http://schemas.openxmlformats.org/drawingml/2006/picture">
                 <pic:pic>
                   <pic:nvPicPr>
-                    <pic:cNvPr id="0" name="image2.png"/>
+                    <pic:cNvPr id="0" name="image1.png"/>
                     <pic:cNvPicPr preferRelativeResize="0"/>
                   </pic:nvPicPr>
                   <pic:blipFill>
@@ -13978,7 +13978,7 @@
       <w:pPr>
         <w:numPr>
           <w:ilvl w:val="0"/>
-          <w:numId w:val="21"/>
+          <w:numId w:val="18"/>
         </w:numPr>
         <w:spacing w:after="0" w:afterAutospacing="0" w:lineRule="auto"/>
         <w:ind w:left="720" w:hanging="360"/>
@@ -14038,7 +14038,7 @@
       <w:pPr>
         <w:numPr>
           <w:ilvl w:val="0"/>
-          <w:numId w:val="21"/>
+          <w:numId w:val="18"/>
         </w:numPr>
         <w:spacing w:after="0" w:afterAutospacing="0" w:lineRule="auto"/>
         <w:ind w:left="720" w:hanging="360"/>
@@ -14098,7 +14098,7 @@
       <w:pPr>
         <w:numPr>
           <w:ilvl w:val="0"/>
-          <w:numId w:val="21"/>
+          <w:numId w:val="18"/>
         </w:numPr>
         <w:spacing w:after="0" w:afterAutospacing="0" w:lineRule="auto"/>
         <w:ind w:left="720" w:hanging="360"/>
@@ -14144,7 +14144,7 @@
       <w:pPr>
         <w:numPr>
           <w:ilvl w:val="0"/>
-          <w:numId w:val="21"/>
+          <w:numId w:val="18"/>
         </w:numPr>
         <w:spacing w:after="0" w:afterAutospacing="0" w:lineRule="auto"/>
         <w:ind w:left="720" w:hanging="360"/>
@@ -14255,7 +14255,7 @@
       <w:pPr>
         <w:numPr>
           <w:ilvl w:val="0"/>
-          <w:numId w:val="21"/>
+          <w:numId w:val="18"/>
         </w:numPr>
         <w:spacing w:after="200" w:lineRule="auto"/>
         <w:ind w:left="720" w:hanging="360"/>
@@ -14490,7 +14490,7 @@
         <w:keepLines w:val="1"/>
         <w:rPr/>
       </w:pPr>
-      <w:bookmarkStart w:colFirst="0" w:colLast="0" w:name="_t1uvqkrz2841" w:id="18"/>
+      <w:bookmarkStart w:colFirst="0" w:colLast="0" w:name="_dg9c2f6xxozk" w:id="18"/>
       <w:bookmarkEnd w:id="18"/>
       <w:r>
         <w:rPr>
@@ -14503,7 +14503,7 @@
       <w:pPr>
         <w:numPr>
           <w:ilvl w:val="0"/>
-          <w:numId w:val="19"/>
+          <w:numId w:val="10"/>
         </w:numPr>
         <w:spacing w:after="0" w:afterAutospacing="0" w:lineRule="auto"/>
         <w:ind w:left="720" w:hanging="360"/>
@@ -14547,7 +14547,7 @@
       <w:pPr>
         <w:numPr>
           <w:ilvl w:val="0"/>
-          <w:numId w:val="19"/>
+          <w:numId w:val="10"/>
         </w:numPr>
         <w:spacing w:after="200" w:lineRule="auto"/>
         <w:ind w:left="720" w:hanging="360"/>
@@ -14767,7 +14767,7 @@
         <w:keepLines w:val="1"/>
         <w:rPr/>
       </w:pPr>
-      <w:bookmarkStart w:colFirst="0" w:colLast="0" w:name="_dtt9lt1ma24n" w:id="19"/>
+      <w:bookmarkStart w:colFirst="0" w:colLast="0" w:name="_24tduf2cndnh" w:id="19"/>
       <w:bookmarkEnd w:id="19"/>
       <w:r>
         <w:rPr>
@@ -15028,7 +15028,7 @@
         <w:keepLines w:val="1"/>
         <w:rPr/>
       </w:pPr>
-      <w:bookmarkStart w:colFirst="0" w:colLast="0" w:name="_2no0l4w470su" w:id="20"/>
+      <w:bookmarkStart w:colFirst="0" w:colLast="0" w:name="_n9lze5j8n5xv" w:id="20"/>
       <w:bookmarkEnd w:id="20"/>
       <w:r>
         <w:rPr>
@@ -15043,7 +15043,7 @@
         <w:keepLines w:val="1"/>
         <w:rPr/>
       </w:pPr>
-      <w:bookmarkStart w:colFirst="0" w:colLast="0" w:name="_lbf42gie8y16" w:id="21"/>
+      <w:bookmarkStart w:colFirst="0" w:colLast="0" w:name="_fgwhpmlct5hb" w:id="21"/>
       <w:bookmarkEnd w:id="21"/>
       <w:r>
         <w:rPr>
@@ -15056,7 +15056,7 @@
       <w:pPr>
         <w:numPr>
           <w:ilvl w:val="0"/>
-          <w:numId w:val="10"/>
+          <w:numId w:val="16"/>
         </w:numPr>
         <w:spacing w:after="200" w:lineRule="auto"/>
         <w:ind w:left="720" w:hanging="360"/>
@@ -15162,12 +15162,12 @@
           <wp:inline distB="114300" distT="114300" distL="114300" distR="114300">
             <wp:extent cx="5674506" cy="697484"/>
             <wp:effectExtent b="0" l="0" r="0" t="0"/>
-            <wp:docPr id="5" name="image1.png"/>
+            <wp:docPr id="4" name="image2.png"/>
             <a:graphic>
               <a:graphicData uri="http://schemas.openxmlformats.org/drawingml/2006/picture">
                 <pic:pic>
                   <pic:nvPicPr>
-                    <pic:cNvPr id="0" name="image1.png"/>
+                    <pic:cNvPr id="0" name="image2.png"/>
                     <pic:cNvPicPr preferRelativeResize="0"/>
                   </pic:nvPicPr>
                   <pic:blipFill>
@@ -15213,7 +15213,7 @@
       <w:pPr>
         <w:numPr>
           <w:ilvl w:val="0"/>
-          <w:numId w:val="22"/>
+          <w:numId w:val="19"/>
         </w:numPr>
         <w:spacing w:after="0" w:afterAutospacing="0" w:lineRule="auto"/>
         <w:ind w:left="720" w:hanging="360"/>
@@ -15245,7 +15245,7 @@
       <w:pPr>
         <w:numPr>
           <w:ilvl w:val="0"/>
-          <w:numId w:val="22"/>
+          <w:numId w:val="19"/>
         </w:numPr>
         <w:spacing w:after="0" w:afterAutospacing="0" w:lineRule="auto"/>
         <w:ind w:left="720" w:hanging="360"/>
@@ -15305,7 +15305,7 @@
       <w:pPr>
         <w:numPr>
           <w:ilvl w:val="0"/>
-          <w:numId w:val="22"/>
+          <w:numId w:val="19"/>
         </w:numPr>
         <w:spacing w:after="0" w:afterAutospacing="0" w:lineRule="auto"/>
         <w:ind w:left="720" w:hanging="360"/>
@@ -15365,7 +15365,7 @@
       <w:pPr>
         <w:numPr>
           <w:ilvl w:val="0"/>
-          <w:numId w:val="22"/>
+          <w:numId w:val="19"/>
         </w:numPr>
         <w:spacing w:after="0" w:afterAutospacing="0" w:lineRule="auto"/>
         <w:ind w:left="720" w:hanging="360"/>
@@ -15397,7 +15397,7 @@
       <w:pPr>
         <w:numPr>
           <w:ilvl w:val="0"/>
-          <w:numId w:val="22"/>
+          <w:numId w:val="19"/>
         </w:numPr>
         <w:spacing w:after="200" w:lineRule="auto"/>
         <w:ind w:left="720" w:hanging="360"/>
@@ -17626,7 +17626,7 @@
         <w:keepLines w:val="1"/>
         <w:rPr/>
       </w:pPr>
-      <w:bookmarkStart w:colFirst="0" w:colLast="0" w:name="_ia50tzyp7wep" w:id="22"/>
+      <w:bookmarkStart w:colFirst="0" w:colLast="0" w:name="_l5a6nusv1buz" w:id="22"/>
       <w:bookmarkEnd w:id="22"/>
       <w:r>
         <w:rPr>
@@ -25632,7 +25632,7 @@
         <w:keepLines w:val="1"/>
         <w:rPr/>
       </w:pPr>
-      <w:bookmarkStart w:colFirst="0" w:colLast="0" w:name="_25digco2yv0x" w:id="23"/>
+      <w:bookmarkStart w:colFirst="0" w:colLast="0" w:name="_g3axvsevic8k" w:id="23"/>
       <w:bookmarkEnd w:id="23"/>
       <w:r>
         <w:rPr>
@@ -25843,7 +25843,7 @@
       <w:pPr>
         <w:numPr>
           <w:ilvl w:val="0"/>
-          <w:numId w:val="11"/>
+          <w:numId w:val="22"/>
         </w:numPr>
         <w:spacing w:after="200" w:lineRule="auto"/>
         <w:ind w:left="720" w:hanging="360"/>
@@ -25943,12 +25943,12 @@
           <wp:inline distB="114300" distT="114300" distL="114300" distR="114300">
             <wp:extent cx="6727635" cy="4206875"/>
             <wp:effectExtent b="0" l="0" r="0" t="0"/>
-            <wp:docPr id="7" name="image3.png"/>
+            <wp:docPr id="8" name="image6.png"/>
             <a:graphic>
               <a:graphicData uri="http://schemas.openxmlformats.org/drawingml/2006/picture">
                 <pic:pic>
                   <pic:nvPicPr>
-                    <pic:cNvPr id="0" name="image3.png"/>
+                    <pic:cNvPr id="0" name="image6.png"/>
                     <pic:cNvPicPr preferRelativeResize="0"/>
                   </pic:nvPicPr>
                   <pic:blipFill>
@@ -26008,12 +26008,12 @@
           <wp:inline distB="114300" distT="114300" distL="114300" distR="114300">
             <wp:extent cx="6727635" cy="4206875"/>
             <wp:effectExtent b="0" l="0" r="0" t="0"/>
-            <wp:docPr id="3" name="image4.png"/>
+            <wp:docPr id="3" name="image3.png"/>
             <a:graphic>
               <a:graphicData uri="http://schemas.openxmlformats.org/drawingml/2006/picture">
                 <pic:pic>
                   <pic:nvPicPr>
-                    <pic:cNvPr id="0" name="image4.png"/>
+                    <pic:cNvPr id="0" name="image3.png"/>
                     <pic:cNvPicPr preferRelativeResize="0"/>
                   </pic:nvPicPr>
                   <pic:blipFill>
@@ -26064,7 +26064,7 @@
       <w:pPr>
         <w:numPr>
           <w:ilvl w:val="0"/>
-          <w:numId w:val="3"/>
+          <w:numId w:val="14"/>
         </w:numPr>
         <w:spacing w:after="200" w:lineRule="auto"/>
         <w:ind w:left="720" w:hanging="360"/>
@@ -26165,12 +26165,12 @@
           <wp:inline distB="114300" distT="114300" distL="114300" distR="114300">
             <wp:extent cx="6727635" cy="4206875"/>
             <wp:effectExtent b="0" l="0" r="0" t="0"/>
-            <wp:docPr id="2" name="image7.png"/>
+            <wp:docPr id="6" name="image5.png"/>
             <a:graphic>
               <a:graphicData uri="http://schemas.openxmlformats.org/drawingml/2006/picture">
                 <pic:pic>
                   <pic:nvPicPr>
-                    <pic:cNvPr id="0" name="image7.png"/>
+                    <pic:cNvPr id="0" name="image5.png"/>
                     <pic:cNvPicPr preferRelativeResize="0"/>
                   </pic:nvPicPr>
                   <pic:blipFill>
@@ -26230,12 +26230,12 @@
           <wp:inline distB="114300" distT="114300" distL="114300" distR="114300">
             <wp:extent cx="6727635" cy="4206875"/>
             <wp:effectExtent b="0" l="0" r="0" t="0"/>
-            <wp:docPr id="6" name="image8.png"/>
+            <wp:docPr id="7" name="image7.png"/>
             <a:graphic>
               <a:graphicData uri="http://schemas.openxmlformats.org/drawingml/2006/picture">
                 <pic:pic>
                   <pic:nvPicPr>
-                    <pic:cNvPr id="0" name="image8.png"/>
+                    <pic:cNvPr id="0" name="image7.png"/>
                     <pic:cNvPicPr preferRelativeResize="0"/>
                   </pic:nvPicPr>
                   <pic:blipFill>
@@ -26289,7 +26289,7 @@
         <w:keepLines w:val="1"/>
         <w:rPr/>
       </w:pPr>
-      <w:bookmarkStart w:colFirst="0" w:colLast="0" w:name="_cuey94kvdrk3" w:id="24"/>
+      <w:bookmarkStart w:colFirst="0" w:colLast="0" w:name="_na6oa03b8o08" w:id="24"/>
       <w:bookmarkEnd w:id="24"/>
       <w:r>
         <w:rPr>
@@ -26305,7 +26305,7 @@
         <w:keepLines w:val="1"/>
         <w:rPr/>
       </w:pPr>
-      <w:bookmarkStart w:colFirst="0" w:colLast="0" w:name="_v7vkykotfqiy" w:id="25"/>
+      <w:bookmarkStart w:colFirst="0" w:colLast="0" w:name="_43g39q2ijfqa" w:id="25"/>
       <w:bookmarkEnd w:id="25"/>
       <w:r>
         <w:rPr>
@@ -26323,7 +26323,7 @@
         <w:rPr>
           <w:rtl w:val="0"/>
         </w:rPr>
-        <w:t xml:space="preserve">The companion 11-slide Workstream 1 presentation deck (</w:t>
+        <w:t xml:space="preserve">The companion 15-slide Workstream 1 presentation deck (</w:t>
       </w:r>
       <w:hyperlink r:id="rId107">
         <w:r>
@@ -26407,15 +26407,15 @@
         <w:tblLook w:val="0600"/>
       </w:tblPr>
       <w:tblGrid>
-        <w:gridCol w:w="1580"/>
-        <w:gridCol w:w="2440"/>
-        <w:gridCol w:w="4340"/>
+        <w:gridCol w:w="1600"/>
+        <w:gridCol w:w="2400"/>
+        <w:gridCol w:w="4360"/>
         <w:gridCol w:w="3040"/>
         <w:tblGridChange w:id="0">
           <w:tblGrid>
-            <w:gridCol w:w="1580"/>
-            <w:gridCol w:w="2440"/>
-            <w:gridCol w:w="4340"/>
+            <w:gridCol w:w="1600"/>
+            <w:gridCol w:w="2400"/>
+            <w:gridCol w:w="4360"/>
             <w:gridCol w:w="3040"/>
           </w:tblGrid>
         </w:tblGridChange>
@@ -26527,7 +26527,7 @@
                 <w:szCs w:val="20"/>
                 <w:rtl w:val="0"/>
               </w:rPr>
-              <w:t xml:space="preserve">Companion WS1 Deck Slides (Streamlined 11-Slide Flow)</w:t>
+              <w:t xml:space="preserve">Companion WS1 Deck Slides (15-Slide Architecture Arc)</w:t>
             </w:r>
           </w:p>
         </w:tc>
@@ -26997,15 +26997,15 @@
                 <w:szCs w:val="19"/>
                 <w:rtl w:val="0"/>
               </w:rPr>
-              <w:t xml:space="preserve">Slides 5, 6 &amp; 8</w:t>
-            </w:r>
-            <w:r>
-              <w:rPr>
-                <w:sz w:val="19"/>
-                <w:szCs w:val="19"/>
-                <w:rtl w:val="0"/>
-              </w:rPr>
-              <w:t xml:space="preserve"> (</w:t>
+              <w:t xml:space="preserve">Slides 5–9</w:t>
+            </w:r>
+            <w:r>
+              <w:rPr>
+                <w:sz w:val="19"/>
+                <w:szCs w:val="19"/>
+                <w:rtl w:val="0"/>
+              </w:rPr>
+              <w:t xml:space="preserve"> (Process Lifecycle, </w:t>
             </w:r>
             <w:r>
               <w:rPr>
@@ -27023,7 +27023,7 @@
                 <w:szCs w:val="19"/>
                 <w:rtl w:val="0"/>
               </w:rPr>
-              <w:t xml:space="preserve"> 3 Logical Security Layers, </w:t>
+              <w:t xml:space="preserve"> Logical Layers, Decision Matrix, </w:t>
             </w:r>
             <w:r>
               <w:rPr>
@@ -27041,7 +27041,7 @@
                 <w:szCs w:val="19"/>
                 <w:rtl w:val="0"/>
               </w:rPr>
-              <w:t xml:space="preserve"> 4 Physical VPC-SC Perimeters &amp; </w:t>
+              <w:t xml:space="preserve"> Figure 1 &amp; </w:t>
             </w:r>
             <w:r>
               <w:rPr>
@@ -27051,15 +27051,15 @@
                 <w:szCs w:val="19"/>
                 <w:rtl w:val="0"/>
               </w:rPr>
-              <w:t xml:space="preserve">L4</w:t>
-            </w:r>
-            <w:r>
-              <w:rPr>
-                <w:sz w:val="19"/>
-                <w:szCs w:val="19"/>
-                <w:rtl w:val="0"/>
-              </w:rPr>
-              <w:t xml:space="preserve"> Wire JWT)</w:t>
+              <w:t xml:space="preserve">L2</w:t>
+            </w:r>
+            <w:r>
+              <w:rPr>
+                <w:sz w:val="19"/>
+                <w:szCs w:val="19"/>
+                <w:rtl w:val="0"/>
+              </w:rPr>
+              <w:t xml:space="preserve"> Figure 2)</w:t>
             </w:r>
           </w:p>
         </w:tc>
@@ -27327,7 +27327,7 @@
                 <w:szCs w:val="19"/>
                 <w:rtl w:val="0"/>
               </w:rPr>
-              <w:t xml:space="preserve">Slide 7</w:t>
+              <w:t xml:space="preserve">Slide 10</w:t>
             </w:r>
             <w:r>
               <w:rPr>
@@ -27729,7 +27729,7 @@
                 <w:szCs w:val="19"/>
                 <w:rtl w:val="0"/>
               </w:rPr>
-              <w:t xml:space="preserve">Slide 9</w:t>
+              <w:t xml:space="preserve">Slides 11–12</w:t>
             </w:r>
             <w:r>
               <w:rPr>
@@ -27747,6 +27747,24 @@
                 <w:szCs w:val="19"/>
                 <w:rtl w:val="0"/>
               </w:rPr>
+              <w:t xml:space="preserve">L4</w:t>
+            </w:r>
+            <w:r>
+              <w:rPr>
+                <w:sz w:val="19"/>
+                <w:szCs w:val="19"/>
+                <w:rtl w:val="0"/>
+              </w:rPr>
+              <w:t xml:space="preserve"> Wire Protocol Normalization &amp; </w:t>
+            </w:r>
+            <w:r>
+              <w:rPr>
+                <w:rFonts w:ascii="Roboto Mono" w:cs="Roboto Mono" w:eastAsia="Roboto Mono" w:hAnsi="Roboto Mono"/>
+                <w:color w:val="188038"/>
+                <w:sz w:val="19"/>
+                <w:szCs w:val="19"/>
+                <w:rtl w:val="0"/>
+              </w:rPr>
               <w:t xml:space="preserve">GAP-01..05</w:t>
             </w:r>
             <w:r>
@@ -27755,7 +27773,7 @@
                 <w:szCs w:val="19"/>
                 <w:rtl w:val="0"/>
               </w:rPr>
-              <w:t xml:space="preserve"> Vulnerability Register, Sunset Hooks &amp; BigQuery OTel SQL)</w:t>
+              <w:t xml:space="preserve"> EAP Product Gap Controls)</w:t>
             </w:r>
           </w:p>
         </w:tc>
@@ -28023,15 +28041,15 @@
                 <w:szCs w:val="19"/>
                 <w:rtl w:val="0"/>
               </w:rPr>
-              <w:t xml:space="preserve">Slides 10–11</w:t>
-            </w:r>
-            <w:r>
-              <w:rPr>
-                <w:sz w:val="19"/>
-                <w:szCs w:val="19"/>
-                <w:rtl w:val="0"/>
-              </w:rPr>
-              <w:t xml:space="preserve"> (Live Console Proof + Merged Well-Architected SLA Scorecard &amp; 5-Part Roadmap)</w:t>
+              <w:t xml:space="preserve">Slides 13–15</w:t>
+            </w:r>
+            <w:r>
+              <w:rPr>
+                <w:sz w:val="19"/>
+                <w:szCs w:val="19"/>
+                <w:rtl w:val="0"/>
+              </w:rPr>
+              <w:t xml:space="preserve"> (Forensic Telemetry, Retina Before/After UI Proofs &amp; Well-Architected SLA Scorecard)</w:t>
             </w:r>
           </w:p>
         </w:tc>
@@ -28318,7 +28336,7 @@
       <w:pPr>
         <w:numPr>
           <w:ilvl w:val="0"/>
-          <w:numId w:val="20"/>
+          <w:numId w:val="23"/>
         </w:numPr>
         <w:shd w:fill="auto" w:val="clear"/>
         <w:spacing w:after="0" w:afterAutospacing="0" w:before="360" w:lineRule="auto"/>
@@ -28352,7 +28370,7 @@
       <w:pPr>
         <w:numPr>
           <w:ilvl w:val="1"/>
-          <w:numId w:val="20"/>
+          <w:numId w:val="23"/>
         </w:numPr>
         <w:spacing w:after="0" w:afterAutospacing="0" w:lineRule="auto"/>
         <w:ind w:left="1440" w:hanging="360"/>
@@ -28401,7 +28419,7 @@
       <w:pPr>
         <w:numPr>
           <w:ilvl w:val="1"/>
-          <w:numId w:val="20"/>
+          <w:numId w:val="23"/>
         </w:numPr>
         <w:spacing w:after="0" w:afterAutospacing="0" w:lineRule="auto"/>
         <w:ind w:left="1440" w:hanging="360"/>
@@ -28467,7 +28485,7 @@
       <w:pPr>
         <w:numPr>
           <w:ilvl w:val="1"/>
-          <w:numId w:val="20"/>
+          <w:numId w:val="23"/>
         </w:numPr>
         <w:spacing w:after="0" w:afterAutospacing="0" w:lineRule="auto"/>
         <w:ind w:left="1440" w:hanging="360"/>
@@ -28533,7 +28551,7 @@
       <w:pPr>
         <w:numPr>
           <w:ilvl w:val="1"/>
-          <w:numId w:val="20"/>
+          <w:numId w:val="23"/>
         </w:numPr>
         <w:spacing w:after="0" w:afterAutospacing="0" w:lineRule="auto"/>
         <w:ind w:left="1440" w:hanging="360"/>
@@ -28599,7 +28617,7 @@
       <w:pPr>
         <w:numPr>
           <w:ilvl w:val="0"/>
-          <w:numId w:val="20"/>
+          <w:numId w:val="23"/>
         </w:numPr>
         <w:spacing w:after="0" w:afterAutospacing="0" w:lineRule="auto"/>
         <w:ind w:left="720" w:hanging="360"/>
@@ -28632,7 +28650,7 @@
       <w:pPr>
         <w:numPr>
           <w:ilvl w:val="1"/>
-          <w:numId w:val="20"/>
+          <w:numId w:val="23"/>
         </w:numPr>
         <w:spacing w:after="0" w:afterAutospacing="0" w:lineRule="auto"/>
         <w:ind w:left="1440" w:hanging="360"/>
@@ -28681,7 +28699,7 @@
       <w:pPr>
         <w:numPr>
           <w:ilvl w:val="1"/>
-          <w:numId w:val="20"/>
+          <w:numId w:val="23"/>
         </w:numPr>
         <w:spacing w:after="0" w:afterAutospacing="0" w:lineRule="auto"/>
         <w:ind w:left="1440" w:hanging="360"/>
@@ -28767,7 +28785,7 @@
       <w:pPr>
         <w:numPr>
           <w:ilvl w:val="0"/>
-          <w:numId w:val="20"/>
+          <w:numId w:val="23"/>
         </w:numPr>
         <w:spacing w:after="0" w:afterAutospacing="0" w:lineRule="auto"/>
         <w:ind w:left="720" w:hanging="360"/>
@@ -28786,7 +28804,7 @@
       <w:pPr>
         <w:numPr>
           <w:ilvl w:val="1"/>
-          <w:numId w:val="20"/>
+          <w:numId w:val="23"/>
         </w:numPr>
         <w:spacing w:after="0" w:afterAutospacing="0" w:lineRule="auto"/>
         <w:ind w:left="1440" w:hanging="360"/>
@@ -28814,7 +28832,7 @@
       <w:pPr>
         <w:numPr>
           <w:ilvl w:val="1"/>
-          <w:numId w:val="20"/>
+          <w:numId w:val="23"/>
         </w:numPr>
         <w:spacing w:after="0" w:afterAutospacing="0" w:lineRule="auto"/>
         <w:ind w:left="1440" w:hanging="360"/>
@@ -28842,7 +28860,7 @@
       <w:pPr>
         <w:numPr>
           <w:ilvl w:val="1"/>
-          <w:numId w:val="20"/>
+          <w:numId w:val="23"/>
         </w:numPr>
         <w:spacing w:after="0" w:afterAutospacing="0" w:lineRule="auto"/>
         <w:ind w:left="1440" w:hanging="360"/>
@@ -28870,7 +28888,7 @@
       <w:pPr>
         <w:numPr>
           <w:ilvl w:val="1"/>
-          <w:numId w:val="20"/>
+          <w:numId w:val="23"/>
         </w:numPr>
         <w:spacing w:after="0" w:afterAutospacing="0" w:lineRule="auto"/>
         <w:ind w:left="1440" w:hanging="360"/>
@@ -28898,7 +28916,7 @@
       <w:pPr>
         <w:numPr>
           <w:ilvl w:val="0"/>
-          <w:numId w:val="20"/>
+          <w:numId w:val="23"/>
         </w:numPr>
         <w:spacing w:after="0" w:afterAutospacing="0" w:lineRule="auto"/>
         <w:ind w:left="720" w:hanging="360"/>
@@ -28917,7 +28935,7 @@
       <w:pPr>
         <w:numPr>
           <w:ilvl w:val="1"/>
-          <w:numId w:val="20"/>
+          <w:numId w:val="23"/>
         </w:numPr>
         <w:spacing w:after="0" w:afterAutospacing="0" w:lineRule="auto"/>
         <w:ind w:left="1440" w:hanging="360"/>
@@ -28945,7 +28963,7 @@
       <w:pPr>
         <w:numPr>
           <w:ilvl w:val="1"/>
-          <w:numId w:val="20"/>
+          <w:numId w:val="23"/>
         </w:numPr>
         <w:spacing w:after="0" w:afterAutospacing="0" w:lineRule="auto"/>
         <w:ind w:left="1440" w:hanging="360"/>
@@ -28973,7 +28991,7 @@
       <w:pPr>
         <w:numPr>
           <w:ilvl w:val="1"/>
-          <w:numId w:val="20"/>
+          <w:numId w:val="23"/>
         </w:numPr>
         <w:spacing w:after="0" w:afterAutospacing="0" w:lineRule="auto"/>
         <w:ind w:left="1440" w:hanging="360"/>
@@ -29001,7 +29019,7 @@
       <w:pPr>
         <w:numPr>
           <w:ilvl w:val="1"/>
-          <w:numId w:val="20"/>
+          <w:numId w:val="23"/>
         </w:numPr>
         <w:spacing w:after="0" w:afterAutospacing="0" w:lineRule="auto"/>
         <w:ind w:left="1440" w:hanging="360"/>
@@ -29029,7 +29047,7 @@
       <w:pPr>
         <w:numPr>
           <w:ilvl w:val="1"/>
-          <w:numId w:val="20"/>
+          <w:numId w:val="23"/>
         </w:numPr>
         <w:spacing w:after="0" w:afterAutospacing="0" w:lineRule="auto"/>
         <w:ind w:left="1440" w:hanging="360"/>
@@ -29078,7 +29096,7 @@
       <w:pPr>
         <w:numPr>
           <w:ilvl w:val="0"/>
-          <w:numId w:val="20"/>
+          <w:numId w:val="23"/>
         </w:numPr>
         <w:spacing w:after="0" w:afterAutospacing="0" w:lineRule="auto"/>
         <w:ind w:left="720" w:hanging="360"/>
@@ -29097,7 +29115,7 @@
       <w:pPr>
         <w:numPr>
           <w:ilvl w:val="1"/>
-          <w:numId w:val="20"/>
+          <w:numId w:val="23"/>
         </w:numPr>
         <w:spacing w:after="0" w:afterAutospacing="0" w:lineRule="auto"/>
         <w:ind w:left="1440" w:hanging="360"/>
@@ -29146,7 +29164,7 @@
       <w:pPr>
         <w:numPr>
           <w:ilvl w:val="1"/>
-          <w:numId w:val="20"/>
+          <w:numId w:val="23"/>
         </w:numPr>
         <w:spacing w:after="0" w:afterAutospacing="0" w:lineRule="auto"/>
         <w:ind w:left="1440" w:hanging="360"/>
@@ -29195,7 +29213,7 @@
       <w:pPr>
         <w:numPr>
           <w:ilvl w:val="1"/>
-          <w:numId w:val="20"/>
+          <w:numId w:val="23"/>
         </w:numPr>
         <w:spacing w:after="200" w:lineRule="auto"/>
         <w:ind w:left="1440" w:hanging="360"/>
@@ -29383,8 +29401,8 @@
   <w:abstractNum w:abstractNumId="2">
     <w:lvl w:ilvl="0">
       <w:start w:val="1"/>
-      <w:numFmt w:val="bullet"/>
-      <w:lvlText w:val="●"/>
+      <w:numFmt w:val="decimal"/>
+      <w:lvlText w:val="%1."/>
       <w:lvlJc w:val="left"/>
       <w:pPr>
         <w:ind w:left="720" w:hanging="360"/>
@@ -29395,8 +29413,8 @@
     </w:lvl>
     <w:lvl w:ilvl="1">
       <w:start w:val="1"/>
-      <w:numFmt w:val="bullet"/>
-      <w:lvlText w:val="○"/>
+      <w:numFmt w:val="lowerLetter"/>
+      <w:lvlText w:val="%2."/>
       <w:lvlJc w:val="left"/>
       <w:pPr>
         <w:ind w:left="1440" w:hanging="360"/>
@@ -29407,9 +29425,9 @@
     </w:lvl>
     <w:lvl w:ilvl="2">
       <w:start w:val="1"/>
-      <w:numFmt w:val="bullet"/>
-      <w:lvlText w:val="■"/>
-      <w:lvlJc w:val="left"/>
+      <w:numFmt w:val="lowerRoman"/>
+      <w:lvlText w:val="%3."/>
+      <w:lvlJc w:val="right"/>
       <w:pPr>
         <w:ind w:left="2160" w:hanging="360"/>
       </w:pPr>
@@ -29419,8 +29437,8 @@
     </w:lvl>
     <w:lvl w:ilvl="3">
       <w:start w:val="1"/>
-      <w:numFmt w:val="bullet"/>
-      <w:lvlText w:val="●"/>
+      <w:numFmt w:val="decimal"/>
+      <w:lvlText w:val="%4."/>
       <w:lvlJc w:val="left"/>
       <w:pPr>
         <w:ind w:left="2880" w:hanging="360"/>
@@ -29431,8 +29449,8 @@
     </w:lvl>
     <w:lvl w:ilvl="4">
       <w:start w:val="1"/>
-      <w:numFmt w:val="bullet"/>
-      <w:lvlText w:val="○"/>
+      <w:numFmt w:val="lowerLetter"/>
+      <w:lvlText w:val="%5."/>
       <w:lvlJc w:val="left"/>
       <w:pPr>
         <w:ind w:left="3600" w:hanging="360"/>
@@ -29443,9 +29461,9 @@
     </w:lvl>
     <w:lvl w:ilvl="5">
       <w:start w:val="1"/>
-      <w:numFmt w:val="bullet"/>
-      <w:lvlText w:val="■"/>
-      <w:lvlJc w:val="left"/>
+      <w:numFmt w:val="lowerRoman"/>
+      <w:lvlText w:val="%6."/>
+      <w:lvlJc w:val="right"/>
       <w:pPr>
         <w:ind w:left="4320" w:hanging="360"/>
       </w:pPr>
@@ -29455,8 +29473,8 @@
     </w:lvl>
     <w:lvl w:ilvl="6">
       <w:start w:val="1"/>
-      <w:numFmt w:val="bullet"/>
-      <w:lvlText w:val="●"/>
+      <w:numFmt w:val="decimal"/>
+      <w:lvlText w:val="%7."/>
       <w:lvlJc w:val="left"/>
       <w:pPr>
         <w:ind w:left="5040" w:hanging="360"/>
@@ -29467,8 +29485,8 @@
     </w:lvl>
     <w:lvl w:ilvl="7">
       <w:start w:val="1"/>
-      <w:numFmt w:val="bullet"/>
-      <w:lvlText w:val="○"/>
+      <w:numFmt w:val="lowerLetter"/>
+      <w:lvlText w:val="%8."/>
       <w:lvlJc w:val="left"/>
       <w:pPr>
         <w:ind w:left="5760" w:hanging="360"/>
@@ -29479,9 +29497,9 @@
     </w:lvl>
     <w:lvl w:ilvl="8">
       <w:start w:val="1"/>
-      <w:numFmt w:val="bullet"/>
-      <w:lvlText w:val="■"/>
-      <w:lvlJc w:val="left"/>
+      <w:numFmt w:val="lowerRoman"/>
+      <w:lvlText w:val="%9."/>
+      <w:lvlJc w:val="right"/>
       <w:pPr>
         <w:ind w:left="6480" w:hanging="360"/>
       </w:pPr>
@@ -29827,7 +29845,7 @@
       <w:lvlText w:val="%1."/>
       <w:lvlJc w:val="left"/>
       <w:pPr>
-        <w:ind w:left="1440" w:hanging="360"/>
+        <w:ind w:left="720" w:hanging="360"/>
       </w:pPr>
       <w:rPr>
         <w:u w:val="none"/>
@@ -29839,7 +29857,7 @@
       <w:lvlText w:val="%2."/>
       <w:lvlJc w:val="left"/>
       <w:pPr>
-        <w:ind w:left="2160" w:hanging="360"/>
+        <w:ind w:left="1440" w:hanging="360"/>
       </w:pPr>
       <w:rPr>
         <w:u w:val="none"/>
@@ -29851,7 +29869,7 @@
       <w:lvlText w:val="%3."/>
       <w:lvlJc w:val="right"/>
       <w:pPr>
-        <w:ind w:left="2880" w:hanging="360"/>
+        <w:ind w:left="2160" w:hanging="360"/>
       </w:pPr>
       <w:rPr>
         <w:u w:val="none"/>
@@ -29863,7 +29881,7 @@
       <w:lvlText w:val="%4."/>
       <w:lvlJc w:val="left"/>
       <w:pPr>
-        <w:ind w:left="3600" w:hanging="360"/>
+        <w:ind w:left="2880" w:hanging="360"/>
       </w:pPr>
       <w:rPr>
         <w:u w:val="none"/>
@@ -29875,7 +29893,7 @@
       <w:lvlText w:val="%5."/>
       <w:lvlJc w:val="left"/>
       <w:pPr>
-        <w:ind w:left="4320" w:hanging="360"/>
+        <w:ind w:left="3600" w:hanging="360"/>
       </w:pPr>
       <w:rPr>
         <w:u w:val="none"/>
@@ -29887,7 +29905,7 @@
       <w:lvlText w:val="%6."/>
       <w:lvlJc w:val="right"/>
       <w:pPr>
-        <w:ind w:left="5040" w:hanging="360"/>
+        <w:ind w:left="4320" w:hanging="360"/>
       </w:pPr>
       <w:rPr>
         <w:u w:val="none"/>
@@ -29899,7 +29917,7 @@
       <w:lvlText w:val="%7."/>
       <w:lvlJc w:val="left"/>
       <w:pPr>
-        <w:ind w:left="5760" w:hanging="360"/>
+        <w:ind w:left="5040" w:hanging="360"/>
       </w:pPr>
       <w:rPr>
         <w:u w:val="none"/>
@@ -29911,7 +29929,7 @@
       <w:lvlText w:val="%8."/>
       <w:lvlJc w:val="left"/>
       <w:pPr>
-        <w:ind w:left="6480" w:hanging="360"/>
+        <w:ind w:left="5760" w:hanging="360"/>
       </w:pPr>
       <w:rPr>
         <w:u w:val="none"/>
@@ -29923,7 +29941,7 @@
       <w:lvlText w:val="%9."/>
       <w:lvlJc w:val="right"/>
       <w:pPr>
-        <w:ind w:left="7200" w:hanging="360"/>
+        <w:ind w:left="6480" w:hanging="360"/>
       </w:pPr>
       <w:rPr>
         <w:u w:val="none"/>
@@ -29933,11 +29951,11 @@
   <w:abstractNum w:abstractNumId="7">
     <w:lvl w:ilvl="0">
       <w:start w:val="1"/>
-      <w:numFmt w:val="bullet"/>
-      <w:lvlText w:val="●"/>
+      <w:numFmt w:val="decimal"/>
+      <w:lvlText w:val="%1."/>
       <w:lvlJc w:val="left"/>
       <w:pPr>
-        <w:ind w:left="720" w:hanging="360"/>
+        <w:ind w:left="1440" w:hanging="360"/>
       </w:pPr>
       <w:rPr>
         <w:u w:val="none"/>
@@ -29945,11 +29963,11 @@
     </w:lvl>
     <w:lvl w:ilvl="1">
       <w:start w:val="1"/>
-      <w:numFmt w:val="bullet"/>
-      <w:lvlText w:val="○"/>
+      <w:numFmt w:val="lowerLetter"/>
+      <w:lvlText w:val="%2."/>
       <w:lvlJc w:val="left"/>
       <w:pPr>
-        <w:ind w:left="1440" w:hanging="360"/>
+        <w:ind w:left="2160" w:hanging="360"/>
       </w:pPr>
       <w:rPr>
         <w:u w:val="none"/>
@@ -29957,11 +29975,11 @@
     </w:lvl>
     <w:lvl w:ilvl="2">
       <w:start w:val="1"/>
-      <w:numFmt w:val="bullet"/>
-      <w:lvlText w:val="■"/>
-      <w:lvlJc w:val="left"/>
-      <w:pPr>
-        <w:ind w:left="2160" w:hanging="360"/>
+      <w:numFmt w:val="lowerRoman"/>
+      <w:lvlText w:val="%3."/>
+      <w:lvlJc w:val="right"/>
+      <w:pPr>
+        <w:ind w:left="2880" w:hanging="360"/>
       </w:pPr>
       <w:rPr>
         <w:u w:val="none"/>
@@ -29969,11 +29987,11 @@
     </w:lvl>
     <w:lvl w:ilvl="3">
       <w:start w:val="1"/>
-      <w:numFmt w:val="bullet"/>
-      <w:lvlText w:val="●"/>
+      <w:numFmt w:val="decimal"/>
+      <w:lvlText w:val="%4."/>
       <w:lvlJc w:val="left"/>
       <w:pPr>
-        <w:ind w:left="2880" w:hanging="360"/>
+        <w:ind w:left="3600" w:hanging="360"/>
       </w:pPr>
       <w:rPr>
         <w:u w:val="none"/>
@@ -29981,11 +29999,11 @@
     </w:lvl>
     <w:lvl w:ilvl="4">
       <w:start w:val="1"/>
-      <w:numFmt w:val="bullet"/>
-      <w:lvlText w:val="○"/>
+      <w:numFmt w:val="lowerLetter"/>
+      <w:lvlText w:val="%5."/>
       <w:lvlJc w:val="left"/>
       <w:pPr>
-        <w:ind w:left="3600" w:hanging="360"/>
+        <w:ind w:left="4320" w:hanging="360"/>
       </w:pPr>
       <w:rPr>
         <w:u w:val="none"/>
@@ -29993,11 +30011,11 @@
     </w:lvl>
     <w:lvl w:ilvl="5">
       <w:start w:val="1"/>
-      <w:numFmt w:val="bullet"/>
-      <w:lvlText w:val="■"/>
-      <w:lvlJc w:val="left"/>
-      <w:pPr>
-        <w:ind w:left="4320" w:hanging="360"/>
+      <w:numFmt w:val="lowerRoman"/>
+      <w:lvlText w:val="%6."/>
+      <w:lvlJc w:val="right"/>
+      <w:pPr>
+        <w:ind w:left="5040" w:hanging="360"/>
       </w:pPr>
       <w:rPr>
         <w:u w:val="none"/>
@@ -30005,11 +30023,11 @@
     </w:lvl>
     <w:lvl w:ilvl="6">
       <w:start w:val="1"/>
-      <w:numFmt w:val="bullet"/>
-      <w:lvlText w:val="●"/>
+      <w:numFmt w:val="decimal"/>
+      <w:lvlText w:val="%7."/>
       <w:lvlJc w:val="left"/>
       <w:pPr>
-        <w:ind w:left="5040" w:hanging="360"/>
+        <w:ind w:left="5760" w:hanging="360"/>
       </w:pPr>
       <w:rPr>
         <w:u w:val="none"/>
@@ -30017,11 +30035,11 @@
     </w:lvl>
     <w:lvl w:ilvl="7">
       <w:start w:val="1"/>
-      <w:numFmt w:val="bullet"/>
-      <w:lvlText w:val="○"/>
+      <w:numFmt w:val="lowerLetter"/>
+      <w:lvlText w:val="%8."/>
       <w:lvlJc w:val="left"/>
       <w:pPr>
-        <w:ind w:left="5760" w:hanging="360"/>
+        <w:ind w:left="6480" w:hanging="360"/>
       </w:pPr>
       <w:rPr>
         <w:u w:val="none"/>
@@ -30029,11 +30047,11 @@
     </w:lvl>
     <w:lvl w:ilvl="8">
       <w:start w:val="1"/>
-      <w:numFmt w:val="bullet"/>
-      <w:lvlText w:val="■"/>
-      <w:lvlJc w:val="left"/>
-      <w:pPr>
-        <w:ind w:left="6480" w:hanging="360"/>
+      <w:numFmt w:val="lowerRoman"/>
+      <w:lvlText w:val="%9."/>
+      <w:lvlJc w:val="right"/>
+      <w:pPr>
+        <w:ind w:left="7200" w:hanging="360"/>
       </w:pPr>
       <w:rPr>
         <w:u w:val="none"/>
@@ -30483,6 +30501,116 @@
   <w:abstractNum w:abstractNumId="12">
     <w:lvl w:ilvl="0">
       <w:start w:val="1"/>
+      <w:numFmt w:val="decimal"/>
+      <w:lvlText w:val="%1."/>
+      <w:lvlJc w:val="left"/>
+      <w:pPr>
+        <w:ind w:left="720" w:hanging="360"/>
+      </w:pPr>
+      <w:rPr>
+        <w:u w:val="none"/>
+      </w:rPr>
+    </w:lvl>
+    <w:lvl w:ilvl="1">
+      <w:start w:val="1"/>
+      <w:numFmt w:val="lowerLetter"/>
+      <w:lvlText w:val="%2."/>
+      <w:lvlJc w:val="left"/>
+      <w:pPr>
+        <w:ind w:left="1440" w:hanging="360"/>
+      </w:pPr>
+      <w:rPr>
+        <w:u w:val="none"/>
+      </w:rPr>
+    </w:lvl>
+    <w:lvl w:ilvl="2">
+      <w:start w:val="1"/>
+      <w:numFmt w:val="lowerRoman"/>
+      <w:lvlText w:val="%3."/>
+      <w:lvlJc w:val="right"/>
+      <w:pPr>
+        <w:ind w:left="2160" w:hanging="360"/>
+      </w:pPr>
+      <w:rPr>
+        <w:u w:val="none"/>
+      </w:rPr>
+    </w:lvl>
+    <w:lvl w:ilvl="3">
+      <w:start w:val="1"/>
+      <w:numFmt w:val="decimal"/>
+      <w:lvlText w:val="%4."/>
+      <w:lvlJc w:val="left"/>
+      <w:pPr>
+        <w:ind w:left="2880" w:hanging="360"/>
+      </w:pPr>
+      <w:rPr>
+        <w:u w:val="none"/>
+      </w:rPr>
+    </w:lvl>
+    <w:lvl w:ilvl="4">
+      <w:start w:val="1"/>
+      <w:numFmt w:val="lowerLetter"/>
+      <w:lvlText w:val="%5."/>
+      <w:lvlJc w:val="left"/>
+      <w:pPr>
+        <w:ind w:left="3600" w:hanging="360"/>
+      </w:pPr>
+      <w:rPr>
+        <w:u w:val="none"/>
+      </w:rPr>
+    </w:lvl>
+    <w:lvl w:ilvl="5">
+      <w:start w:val="1"/>
+      <w:numFmt w:val="lowerRoman"/>
+      <w:lvlText w:val="%6."/>
+      <w:lvlJc w:val="right"/>
+      <w:pPr>
+        <w:ind w:left="4320" w:hanging="360"/>
+      </w:pPr>
+      <w:rPr>
+        <w:u w:val="none"/>
+      </w:rPr>
+    </w:lvl>
+    <w:lvl w:ilvl="6">
+      <w:start w:val="1"/>
+      <w:numFmt w:val="decimal"/>
+      <w:lvlText w:val="%7."/>
+      <w:lvlJc w:val="left"/>
+      <w:pPr>
+        <w:ind w:left="5040" w:hanging="360"/>
+      </w:pPr>
+      <w:rPr>
+        <w:u w:val="none"/>
+      </w:rPr>
+    </w:lvl>
+    <w:lvl w:ilvl="7">
+      <w:start w:val="1"/>
+      <w:numFmt w:val="lowerLetter"/>
+      <w:lvlText w:val="%8."/>
+      <w:lvlJc w:val="left"/>
+      <w:pPr>
+        <w:ind w:left="5760" w:hanging="360"/>
+      </w:pPr>
+      <w:rPr>
+        <w:u w:val="none"/>
+      </w:rPr>
+    </w:lvl>
+    <w:lvl w:ilvl="8">
+      <w:start w:val="1"/>
+      <w:numFmt w:val="lowerRoman"/>
+      <w:lvlText w:val="%9."/>
+      <w:lvlJc w:val="right"/>
+      <w:pPr>
+        <w:ind w:left="6480" w:hanging="360"/>
+      </w:pPr>
+      <w:rPr>
+        <w:u w:val="none"/>
+      </w:rPr>
+    </w:lvl>
+  </w:abstractNum>
+  <w:abstractNum w:abstractNumId="13">
+    <w:lvl w:ilvl="0">
+      <w:start w:val="1"/>
       <w:numFmt w:val="bullet"/>
       <w:lvlText w:val="●"/>
       <w:lvlJc w:val="left"/>
@@ -30590,11 +30718,11 @@
       </w:rPr>
     </w:lvl>
   </w:abstractNum>
-  <w:abstractNum w:abstractNumId="13">
+  <w:abstractNum w:abstractNumId="14">
     <w:lvl w:ilvl="0">
       <w:start w:val="1"/>
-      <w:numFmt w:val="decimal"/>
-      <w:lvlText w:val="%1."/>
+      <w:numFmt w:val="bullet"/>
+      <w:lvlText w:val="●"/>
       <w:lvlJc w:val="left"/>
       <w:pPr>
         <w:ind w:left="720" w:hanging="360"/>
@@ -30605,8 +30733,8 @@
     </w:lvl>
     <w:lvl w:ilvl="1">
       <w:start w:val="1"/>
-      <w:numFmt w:val="lowerLetter"/>
-      <w:lvlText w:val="%2."/>
+      <w:numFmt w:val="bullet"/>
+      <w:lvlText w:val="○"/>
       <w:lvlJc w:val="left"/>
       <w:pPr>
         <w:ind w:left="1440" w:hanging="360"/>
@@ -30617,9 +30745,9 @@
     </w:lvl>
     <w:lvl w:ilvl="2">
       <w:start w:val="1"/>
-      <w:numFmt w:val="lowerRoman"/>
-      <w:lvlText w:val="%3."/>
-      <w:lvlJc w:val="right"/>
+      <w:numFmt w:val="bullet"/>
+      <w:lvlText w:val="■"/>
+      <w:lvlJc w:val="left"/>
       <w:pPr>
         <w:ind w:left="2160" w:hanging="360"/>
       </w:pPr>
@@ -30629,8 +30757,8 @@
     </w:lvl>
     <w:lvl w:ilvl="3">
       <w:start w:val="1"/>
-      <w:numFmt w:val="decimal"/>
-      <w:lvlText w:val="%4."/>
+      <w:numFmt w:val="bullet"/>
+      <w:lvlText w:val="●"/>
       <w:lvlJc w:val="left"/>
       <w:pPr>
         <w:ind w:left="2880" w:hanging="360"/>
@@ -30641,8 +30769,8 @@
     </w:lvl>
     <w:lvl w:ilvl="4">
       <w:start w:val="1"/>
-      <w:numFmt w:val="lowerLetter"/>
-      <w:lvlText w:val="%5."/>
+      <w:numFmt w:val="bullet"/>
+      <w:lvlText w:val="○"/>
       <w:lvlJc w:val="left"/>
       <w:pPr>
         <w:ind w:left="3600" w:hanging="360"/>
@@ -30653,9 +30781,9 @@
     </w:lvl>
     <w:lvl w:ilvl="5">
       <w:start w:val="1"/>
-      <w:numFmt w:val="lowerRoman"/>
-      <w:lvlText w:val="%6."/>
-      <w:lvlJc w:val="right"/>
+      <w:numFmt w:val="bullet"/>
+      <w:lvlText w:val="■"/>
+      <w:lvlJc w:val="left"/>
       <w:pPr>
         <w:ind w:left="4320" w:hanging="360"/>
       </w:pPr>
@@ -30665,8 +30793,8 @@
     </w:lvl>
     <w:lvl w:ilvl="6">
       <w:start w:val="1"/>
-      <w:numFmt w:val="decimal"/>
-      <w:lvlText w:val="%7."/>
+      <w:numFmt w:val="bullet"/>
+      <w:lvlText w:val="●"/>
       <w:lvlJc w:val="left"/>
       <w:pPr>
         <w:ind w:left="5040" w:hanging="360"/>
@@ -30677,8 +30805,8 @@
     </w:lvl>
     <w:lvl w:ilvl="7">
       <w:start w:val="1"/>
-      <w:numFmt w:val="lowerLetter"/>
-      <w:lvlText w:val="%8."/>
+      <w:numFmt w:val="bullet"/>
+      <w:lvlText w:val="○"/>
       <w:lvlJc w:val="left"/>
       <w:pPr>
         <w:ind w:left="5760" w:hanging="360"/>
@@ -30689,119 +30817,9 @@
     </w:lvl>
     <w:lvl w:ilvl="8">
       <w:start w:val="1"/>
-      <w:numFmt w:val="lowerRoman"/>
-      <w:lvlText w:val="%9."/>
-      <w:lvlJc w:val="right"/>
-      <w:pPr>
-        <w:ind w:left="6480" w:hanging="360"/>
-      </w:pPr>
-      <w:rPr>
-        <w:u w:val="none"/>
-      </w:rPr>
-    </w:lvl>
-  </w:abstractNum>
-  <w:abstractNum w:abstractNumId="14">
-    <w:lvl w:ilvl="0">
-      <w:start w:val="1"/>
-      <w:numFmt w:val="decimal"/>
-      <w:lvlText w:val="%1."/>
+      <w:numFmt w:val="bullet"/>
+      <w:lvlText w:val="■"/>
       <w:lvlJc w:val="left"/>
-      <w:pPr>
-        <w:ind w:left="720" w:hanging="360"/>
-      </w:pPr>
-      <w:rPr>
-        <w:u w:val="none"/>
-      </w:rPr>
-    </w:lvl>
-    <w:lvl w:ilvl="1">
-      <w:start w:val="1"/>
-      <w:numFmt w:val="lowerLetter"/>
-      <w:lvlText w:val="%2."/>
-      <w:lvlJc w:val="left"/>
-      <w:pPr>
-        <w:ind w:left="1440" w:hanging="360"/>
-      </w:pPr>
-      <w:rPr>
-        <w:u w:val="none"/>
-      </w:rPr>
-    </w:lvl>
-    <w:lvl w:ilvl="2">
-      <w:start w:val="1"/>
-      <w:numFmt w:val="lowerRoman"/>
-      <w:lvlText w:val="%3."/>
-      <w:lvlJc w:val="right"/>
-      <w:pPr>
-        <w:ind w:left="2160" w:hanging="360"/>
-      </w:pPr>
-      <w:rPr>
-        <w:u w:val="none"/>
-      </w:rPr>
-    </w:lvl>
-    <w:lvl w:ilvl="3">
-      <w:start w:val="1"/>
-      <w:numFmt w:val="decimal"/>
-      <w:lvlText w:val="%4."/>
-      <w:lvlJc w:val="left"/>
-      <w:pPr>
-        <w:ind w:left="2880" w:hanging="360"/>
-      </w:pPr>
-      <w:rPr>
-        <w:u w:val="none"/>
-      </w:rPr>
-    </w:lvl>
-    <w:lvl w:ilvl="4">
-      <w:start w:val="1"/>
-      <w:numFmt w:val="lowerLetter"/>
-      <w:lvlText w:val="%5."/>
-      <w:lvlJc w:val="left"/>
-      <w:pPr>
-        <w:ind w:left="3600" w:hanging="360"/>
-      </w:pPr>
-      <w:rPr>
-        <w:u w:val="none"/>
-      </w:rPr>
-    </w:lvl>
-    <w:lvl w:ilvl="5">
-      <w:start w:val="1"/>
-      <w:numFmt w:val="lowerRoman"/>
-      <w:lvlText w:val="%6."/>
-      <w:lvlJc w:val="right"/>
-      <w:pPr>
-        <w:ind w:left="4320" w:hanging="360"/>
-      </w:pPr>
-      <w:rPr>
-        <w:u w:val="none"/>
-      </w:rPr>
-    </w:lvl>
-    <w:lvl w:ilvl="6">
-      <w:start w:val="1"/>
-      <w:numFmt w:val="decimal"/>
-      <w:lvlText w:val="%7."/>
-      <w:lvlJc w:val="left"/>
-      <w:pPr>
-        <w:ind w:left="5040" w:hanging="360"/>
-      </w:pPr>
-      <w:rPr>
-        <w:u w:val="none"/>
-      </w:rPr>
-    </w:lvl>
-    <w:lvl w:ilvl="7">
-      <w:start w:val="1"/>
-      <w:numFmt w:val="lowerLetter"/>
-      <w:lvlText w:val="%8."/>
-      <w:lvlJc w:val="left"/>
-      <w:pPr>
-        <w:ind w:left="5760" w:hanging="360"/>
-      </w:pPr>
-      <w:rPr>
-        <w:u w:val="none"/>
-      </w:rPr>
-    </w:lvl>
-    <w:lvl w:ilvl="8">
-      <w:start w:val="1"/>
-      <w:numFmt w:val="lowerRoman"/>
-      <w:lvlText w:val="%9."/>
-      <w:lvlJc w:val="right"/>
       <w:pPr>
         <w:ind w:left="6480" w:hanging="360"/>
       </w:pPr>
@@ -31143,8 +31161,8 @@
   <w:abstractNum w:abstractNumId="18">
     <w:lvl w:ilvl="0">
       <w:start w:val="1"/>
-      <w:numFmt w:val="decimal"/>
-      <w:lvlText w:val="%1."/>
+      <w:numFmt w:val="bullet"/>
+      <w:lvlText w:val="●"/>
       <w:lvlJc w:val="left"/>
       <w:pPr>
         <w:ind w:left="720" w:hanging="360"/>
@@ -31155,8 +31173,8 @@
     </w:lvl>
     <w:lvl w:ilvl="1">
       <w:start w:val="1"/>
-      <w:numFmt w:val="lowerLetter"/>
-      <w:lvlText w:val="%2."/>
+      <w:numFmt w:val="bullet"/>
+      <w:lvlText w:val="○"/>
       <w:lvlJc w:val="left"/>
       <w:pPr>
         <w:ind w:left="1440" w:hanging="360"/>
@@ -31167,9 +31185,9 @@
     </w:lvl>
     <w:lvl w:ilvl="2">
       <w:start w:val="1"/>
-      <w:numFmt w:val="lowerRoman"/>
-      <w:lvlText w:val="%3."/>
-      <w:lvlJc w:val="right"/>
+      <w:numFmt w:val="bullet"/>
+      <w:lvlText w:val="■"/>
+      <w:lvlJc w:val="left"/>
       <w:pPr>
         <w:ind w:left="2160" w:hanging="360"/>
       </w:pPr>
@@ -31179,8 +31197,8 @@
     </w:lvl>
     <w:lvl w:ilvl="3">
       <w:start w:val="1"/>
-      <w:numFmt w:val="decimal"/>
-      <w:lvlText w:val="%4."/>
+      <w:numFmt w:val="bullet"/>
+      <w:lvlText w:val="●"/>
       <w:lvlJc w:val="left"/>
       <w:pPr>
         <w:ind w:left="2880" w:hanging="360"/>
@@ -31191,8 +31209,8 @@
     </w:lvl>
     <w:lvl w:ilvl="4">
       <w:start w:val="1"/>
-      <w:numFmt w:val="lowerLetter"/>
-      <w:lvlText w:val="%5."/>
+      <w:numFmt w:val="bullet"/>
+      <w:lvlText w:val="○"/>
       <w:lvlJc w:val="left"/>
       <w:pPr>
         <w:ind w:left="3600" w:hanging="360"/>
@@ -31203,9 +31221,9 @@
     </w:lvl>
     <w:lvl w:ilvl="5">
       <w:start w:val="1"/>
-      <w:numFmt w:val="lowerRoman"/>
-      <w:lvlText w:val="%6."/>
-      <w:lvlJc w:val="right"/>
+      <w:numFmt w:val="bullet"/>
+      <w:lvlText w:val="■"/>
+      <w:lvlJc w:val="left"/>
       <w:pPr>
         <w:ind w:left="4320" w:hanging="360"/>
       </w:pPr>
@@ -31215,8 +31233,8 @@
     </w:lvl>
     <w:lvl w:ilvl="6">
       <w:start w:val="1"/>
-      <w:numFmt w:val="decimal"/>
-      <w:lvlText w:val="%7."/>
+      <w:numFmt w:val="bullet"/>
+      <w:lvlText w:val="●"/>
       <w:lvlJc w:val="left"/>
       <w:pPr>
         <w:ind w:left="5040" w:hanging="360"/>
@@ -31227,8 +31245,8 @@
     </w:lvl>
     <w:lvl w:ilvl="7">
       <w:start w:val="1"/>
-      <w:numFmt w:val="lowerLetter"/>
-      <w:lvlText w:val="%8."/>
+      <w:numFmt w:val="bullet"/>
+      <w:lvlText w:val="○"/>
       <w:lvlJc w:val="left"/>
       <w:pPr>
         <w:ind w:left="5760" w:hanging="360"/>
@@ -31239,9 +31257,9 @@
     </w:lvl>
     <w:lvl w:ilvl="8">
       <w:start w:val="1"/>
-      <w:numFmt w:val="lowerRoman"/>
-      <w:lvlText w:val="%9."/>
-      <w:lvlJc w:val="right"/>
+      <w:numFmt w:val="bullet"/>
+      <w:lvlText w:val="■"/>
+      <w:lvlJc w:val="left"/>
       <w:pPr>
         <w:ind w:left="6480" w:hanging="360"/>
       </w:pPr>

</xml_diff>